<commit_message>
pytorch with custom dataset function + data augmentation
</commit_message>
<xml_diff>
--- a/Days51-55 Neural Network with pytorch/plan.docx
+++ b/Days51-55 Neural Network with pytorch/plan.docx
@@ -54,8 +54,23 @@
           <w:lang w:eastAsia="fr-FR"/>
           <w14:ligatures w14:val="none"/>
         </w:rPr>
-        <w:t>1. Introduction à PyTorch</w:t>
-      </w:r>
+        <w:t xml:space="preserve">1. Introduction à </w:t>
+      </w:r>
+      <w:proofErr w:type="spellStart"/>
+      <w:r>
+        <w:rPr>
+          <w:rFonts w:ascii="Times New Roman" w:eastAsia="Times New Roman" w:hAnsi="Times New Roman" w:cs="Times New Roman"/>
+          <w:b/>
+          <w:bCs/>
+          <w:kern w:val="0"/>
+          <w:sz w:val="36"/>
+          <w:szCs w:val="36"/>
+          <w:lang w:eastAsia="fr-FR"/>
+          <w14:ligatures w14:val="none"/>
+        </w:rPr>
+        <w:t>PyTorch</w:t>
+      </w:r>
+      <w:proofErr w:type="spellEnd"/>
     </w:p>
     <w:p>
       <w:pPr>
@@ -113,8 +128,48 @@
           <w:lang w:eastAsia="fr-FR"/>
           <w14:ligatures w14:val="none"/>
         </w:rPr>
-        <w:t>Différence PyTorch vs TensorFlow</w:t>
-      </w:r>
+        <w:t xml:space="preserve">Différence </w:t>
+      </w:r>
+      <w:proofErr w:type="spellStart"/>
+      <w:r>
+        <w:rPr>
+          <w:rFonts w:ascii="Times New Roman" w:eastAsia="Times New Roman" w:hAnsi="Times New Roman" w:cs="Times New Roman"/>
+          <w:kern w:val="0"/>
+          <w:sz w:val="24"/>
+          <w:szCs w:val="24"/>
+          <w:highlight w:val="yellow"/>
+          <w:lang w:eastAsia="fr-FR"/>
+          <w14:ligatures w14:val="none"/>
+        </w:rPr>
+        <w:t>PyTorch</w:t>
+      </w:r>
+      <w:proofErr w:type="spellEnd"/>
+      <w:r>
+        <w:rPr>
+          <w:rFonts w:ascii="Times New Roman" w:eastAsia="Times New Roman" w:hAnsi="Times New Roman" w:cs="Times New Roman"/>
+          <w:kern w:val="0"/>
+          <w:sz w:val="24"/>
+          <w:szCs w:val="24"/>
+          <w:highlight w:val="yellow"/>
+          <w:lang w:eastAsia="fr-FR"/>
+          <w14:ligatures w14:val="none"/>
+        </w:rPr>
+        <w:t xml:space="preserve"> vs </w:t>
+      </w:r>
+      <w:proofErr w:type="spellStart"/>
+      <w:r>
+        <w:rPr>
+          <w:rFonts w:ascii="Times New Roman" w:eastAsia="Times New Roman" w:hAnsi="Times New Roman" w:cs="Times New Roman"/>
+          <w:kern w:val="0"/>
+          <w:sz w:val="24"/>
+          <w:szCs w:val="24"/>
+          <w:highlight w:val="yellow"/>
+          <w:lang w:eastAsia="fr-FR"/>
+          <w14:ligatures w14:val="none"/>
+        </w:rPr>
+        <w:t>TensorFlow</w:t>
+      </w:r>
+      <w:proofErr w:type="spellEnd"/>
     </w:p>
     <w:p>
       <w:pPr>
@@ -163,6 +218,7 @@
           <w14:ligatures w14:val="none"/>
         </w:rPr>
       </w:pPr>
+      <w:proofErr w:type="spellStart"/>
       <w:r>
         <w:rPr>
           <w:rFonts w:ascii="Times New Roman" w:eastAsia="Times New Roman" w:hAnsi="Times New Roman" w:cs="Times New Roman"/>
@@ -173,8 +229,61 @@
           <w:lang w:eastAsia="fr-FR"/>
           <w14:ligatures w14:val="none"/>
         </w:rPr>
-        <w:t>Tensors vs Numpy arrays</w:t>
-      </w:r>
+        <w:t>Tensors</w:t>
+      </w:r>
+      <w:proofErr w:type="spellEnd"/>
+      <w:r>
+        <w:rPr>
+          <w:rFonts w:ascii="Times New Roman" w:eastAsia="Times New Roman" w:hAnsi="Times New Roman" w:cs="Times New Roman"/>
+          <w:kern w:val="0"/>
+          <w:sz w:val="24"/>
+          <w:szCs w:val="24"/>
+          <w:highlight w:val="yellow"/>
+          <w:lang w:eastAsia="fr-FR"/>
+          <w14:ligatures w14:val="none"/>
+        </w:rPr>
+        <w:t xml:space="preserve"> vs </w:t>
+      </w:r>
+      <w:proofErr w:type="spellStart"/>
+      <w:r>
+        <w:rPr>
+          <w:rFonts w:ascii="Times New Roman" w:eastAsia="Times New Roman" w:hAnsi="Times New Roman" w:cs="Times New Roman"/>
+          <w:kern w:val="0"/>
+          <w:sz w:val="24"/>
+          <w:szCs w:val="24"/>
+          <w:highlight w:val="yellow"/>
+          <w:lang w:eastAsia="fr-FR"/>
+          <w14:ligatures w14:val="none"/>
+        </w:rPr>
+        <w:t>Numpy</w:t>
+      </w:r>
+      <w:proofErr w:type="spellEnd"/>
+      <w:r>
+        <w:rPr>
+          <w:rFonts w:ascii="Times New Roman" w:eastAsia="Times New Roman" w:hAnsi="Times New Roman" w:cs="Times New Roman"/>
+          <w:kern w:val="0"/>
+          <w:sz w:val="24"/>
+          <w:szCs w:val="24"/>
+          <w:highlight w:val="yellow"/>
+          <w:lang w:eastAsia="fr-FR"/>
+          <w14:ligatures w14:val="none"/>
+        </w:rPr>
+        <w:t xml:space="preserve"> </w:t>
+      </w:r>
+      <w:proofErr w:type="spellStart"/>
+      <w:r>
+        <w:rPr>
+          <w:rFonts w:ascii="Times New Roman" w:eastAsia="Times New Roman" w:hAnsi="Times New Roman" w:cs="Times New Roman"/>
+          <w:kern w:val="0"/>
+          <w:sz w:val="24"/>
+          <w:szCs w:val="24"/>
+          <w:highlight w:val="yellow"/>
+          <w:lang w:eastAsia="fr-FR"/>
+          <w14:ligatures w14:val="none"/>
+        </w:rPr>
+        <w:t>arrays</w:t>
+      </w:r>
+      <w:proofErr w:type="spellEnd"/>
     </w:p>
     <w:p>
       <w:pPr>
@@ -258,8 +367,51 @@
           <w:lang w:eastAsia="fr-FR"/>
           <w14:ligatures w14:val="none"/>
         </w:rPr>
-        <w:t>2. Autograd : le cœur de PyTorch</w:t>
-      </w:r>
+        <w:t xml:space="preserve">2. </w:t>
+      </w:r>
+      <w:proofErr w:type="spellStart"/>
+      <w:r>
+        <w:rPr>
+          <w:rFonts w:ascii="Times New Roman" w:eastAsia="Times New Roman" w:hAnsi="Times New Roman" w:cs="Times New Roman"/>
+          <w:b/>
+          <w:bCs/>
+          <w:kern w:val="0"/>
+          <w:sz w:val="36"/>
+          <w:szCs w:val="36"/>
+          <w:lang w:eastAsia="fr-FR"/>
+          <w14:ligatures w14:val="none"/>
+        </w:rPr>
+        <w:t>Autograd</w:t>
+      </w:r>
+      <w:proofErr w:type="spellEnd"/>
+      <w:r>
+        <w:rPr>
+          <w:rFonts w:ascii="Times New Roman" w:eastAsia="Times New Roman" w:hAnsi="Times New Roman" w:cs="Times New Roman"/>
+          <w:b/>
+          <w:bCs/>
+          <w:kern w:val="0"/>
+          <w:sz w:val="36"/>
+          <w:szCs w:val="36"/>
+          <w:lang w:eastAsia="fr-FR"/>
+          <w14:ligatures w14:val="none"/>
+        </w:rPr>
+        <w:t xml:space="preserve"> : le cœur de </w:t>
+      </w:r>
+      <w:proofErr w:type="spellStart"/>
+      <w:r>
+        <w:rPr>
+          <w:rFonts w:ascii="Times New Roman" w:eastAsia="Times New Roman" w:hAnsi="Times New Roman" w:cs="Times New Roman"/>
+          <w:b/>
+          <w:bCs/>
+          <w:kern w:val="0"/>
+          <w:sz w:val="36"/>
+          <w:szCs w:val="36"/>
+          <w:lang w:eastAsia="fr-FR"/>
+          <w14:ligatures w14:val="none"/>
+        </w:rPr>
+        <w:t>PyTorch</w:t>
+      </w:r>
+      <w:proofErr w:type="spellEnd"/>
     </w:p>
     <w:p>
       <w:pPr>
@@ -332,20 +484,36 @@
           <w:kern w:val="0"/>
           <w:sz w:val="24"/>
           <w:szCs w:val="24"/>
-          <w:lang w:eastAsia="fr-FR"/>
-          <w14:ligatures w14:val="none"/>
-        </w:rPr>
-      </w:pPr>
-      <w:r>
-        <w:rPr>
-          <w:rFonts w:ascii="Times New Roman" w:eastAsia="Times New Roman" w:hAnsi="Times New Roman" w:cs="Times New Roman"/>
-          <w:kern w:val="0"/>
-          <w:sz w:val="24"/>
-          <w:szCs w:val="24"/>
-          <w:lang w:eastAsia="fr-FR"/>
-          <w14:ligatures w14:val="none"/>
-        </w:rPr>
-        <w:t>Backpropagation automatique</w:t>
+          <w:highlight w:val="yellow"/>
+          <w:lang w:eastAsia="fr-FR"/>
+          <w14:ligatures w14:val="none"/>
+        </w:rPr>
+      </w:pPr>
+      <w:proofErr w:type="spellStart"/>
+      <w:r>
+        <w:rPr>
+          <w:rFonts w:ascii="Times New Roman" w:eastAsia="Times New Roman" w:hAnsi="Times New Roman" w:cs="Times New Roman"/>
+          <w:kern w:val="0"/>
+          <w:sz w:val="24"/>
+          <w:szCs w:val="24"/>
+          <w:highlight w:val="yellow"/>
+          <w:lang w:eastAsia="fr-FR"/>
+          <w14:ligatures w14:val="none"/>
+        </w:rPr>
+        <w:t>Backpropagation</w:t>
+      </w:r>
+      <w:proofErr w:type="spellEnd"/>
+      <w:r>
+        <w:rPr>
+          <w:rFonts w:ascii="Times New Roman" w:eastAsia="Times New Roman" w:hAnsi="Times New Roman" w:cs="Times New Roman"/>
+          <w:kern w:val="0"/>
+          <w:sz w:val="24"/>
+          <w:szCs w:val="24"/>
+          <w:highlight w:val="yellow"/>
+          <w:lang w:eastAsia="fr-FR"/>
+          <w14:ligatures w14:val="none"/>
+        </w:rPr>
+        <w:t xml:space="preserve"> automatique</w:t>
       </w:r>
     </w:p>
     <w:p>
@@ -360,16 +528,18 @@
           <w:kern w:val="0"/>
           <w:sz w:val="24"/>
           <w:szCs w:val="24"/>
-          <w:lang w:eastAsia="fr-FR"/>
-          <w14:ligatures w14:val="none"/>
-        </w:rPr>
-      </w:pPr>
-      <w:r>
-        <w:rPr>
-          <w:rFonts w:ascii="Times New Roman" w:eastAsia="Times New Roman" w:hAnsi="Times New Roman" w:cs="Times New Roman"/>
-          <w:kern w:val="0"/>
-          <w:sz w:val="24"/>
-          <w:szCs w:val="24"/>
+          <w:highlight w:val="yellow"/>
+          <w:lang w:eastAsia="fr-FR"/>
+          <w14:ligatures w14:val="none"/>
+        </w:rPr>
+      </w:pPr>
+      <w:r>
+        <w:rPr>
+          <w:rFonts w:ascii="Times New Roman" w:eastAsia="Times New Roman" w:hAnsi="Times New Roman" w:cs="Times New Roman"/>
+          <w:kern w:val="0"/>
+          <w:sz w:val="24"/>
+          <w:szCs w:val="24"/>
+          <w:highlight w:val="yellow"/>
           <w:lang w:eastAsia="fr-FR"/>
           <w14:ligatures w14:val="none"/>
         </w:rPr>
@@ -472,16 +642,18 @@
           <w:kern w:val="0"/>
           <w:sz w:val="24"/>
           <w:szCs w:val="24"/>
-          <w:lang w:eastAsia="fr-FR"/>
-          <w14:ligatures w14:val="none"/>
-        </w:rPr>
-      </w:pPr>
-      <w:r>
-        <w:rPr>
-          <w:rFonts w:ascii="Times New Roman" w:eastAsia="Times New Roman" w:hAnsi="Times New Roman" w:cs="Times New Roman"/>
-          <w:kern w:val="0"/>
-          <w:sz w:val="24"/>
-          <w:szCs w:val="24"/>
+          <w:highlight w:val="yellow"/>
+          <w:lang w:eastAsia="fr-FR"/>
+          <w14:ligatures w14:val="none"/>
+        </w:rPr>
+      </w:pPr>
+      <w:r>
+        <w:rPr>
+          <w:rFonts w:ascii="Times New Roman" w:eastAsia="Times New Roman" w:hAnsi="Times New Roman" w:cs="Times New Roman"/>
+          <w:kern w:val="0"/>
+          <w:sz w:val="24"/>
+          <w:szCs w:val="24"/>
+          <w:highlight w:val="yellow"/>
           <w:lang w:eastAsia="fr-FR"/>
           <w14:ligatures w14:val="none"/>
         </w:rPr>
@@ -500,16 +672,18 @@
           <w:kern w:val="0"/>
           <w:sz w:val="24"/>
           <w:szCs w:val="24"/>
-          <w:lang w:eastAsia="fr-FR"/>
-          <w14:ligatures w14:val="none"/>
-        </w:rPr>
-      </w:pPr>
-      <w:r>
-        <w:rPr>
-          <w:rFonts w:ascii="Times New Roman" w:eastAsia="Times New Roman" w:hAnsi="Times New Roman" w:cs="Times New Roman"/>
-          <w:kern w:val="0"/>
-          <w:sz w:val="24"/>
-          <w:szCs w:val="24"/>
+          <w:highlight w:val="yellow"/>
+          <w:lang w:eastAsia="fr-FR"/>
+          <w14:ligatures w14:val="none"/>
+        </w:rPr>
+      </w:pPr>
+      <w:r>
+        <w:rPr>
+          <w:rFonts w:ascii="Times New Roman" w:eastAsia="Times New Roman" w:hAnsi="Times New Roman" w:cs="Times New Roman"/>
+          <w:kern w:val="0"/>
+          <w:sz w:val="24"/>
+          <w:szCs w:val="24"/>
+          <w:highlight w:val="yellow"/>
           <w:lang w:eastAsia="fr-FR"/>
           <w14:ligatures w14:val="none"/>
         </w:rPr>
@@ -528,16 +702,18 @@
           <w:kern w:val="0"/>
           <w:sz w:val="24"/>
           <w:szCs w:val="24"/>
-          <w:lang w:eastAsia="fr-FR"/>
-          <w14:ligatures w14:val="none"/>
-        </w:rPr>
-      </w:pPr>
-      <w:r>
-        <w:rPr>
-          <w:rFonts w:ascii="Times New Roman" w:eastAsia="Times New Roman" w:hAnsi="Times New Roman" w:cs="Times New Roman"/>
-          <w:kern w:val="0"/>
-          <w:sz w:val="24"/>
-          <w:szCs w:val="24"/>
+          <w:highlight w:val="yellow"/>
+          <w:lang w:eastAsia="fr-FR"/>
+          <w14:ligatures w14:val="none"/>
+        </w:rPr>
+      </w:pPr>
+      <w:r>
+        <w:rPr>
+          <w:rFonts w:ascii="Times New Roman" w:eastAsia="Times New Roman" w:hAnsi="Times New Roman" w:cs="Times New Roman"/>
+          <w:kern w:val="0"/>
+          <w:sz w:val="24"/>
+          <w:szCs w:val="24"/>
+          <w:highlight w:val="yellow"/>
           <w:lang w:eastAsia="fr-FR"/>
           <w14:ligatures w14:val="none"/>
         </w:rPr>
@@ -556,21 +732,25 @@
           <w:kern w:val="0"/>
           <w:sz w:val="24"/>
           <w:szCs w:val="24"/>
-          <w:lang w:eastAsia="fr-FR"/>
-          <w14:ligatures w14:val="none"/>
-        </w:rPr>
-      </w:pPr>
-      <w:r>
-        <w:rPr>
-          <w:rFonts w:ascii="Times New Roman" w:eastAsia="Times New Roman" w:hAnsi="Times New Roman" w:cs="Times New Roman"/>
-          <w:kern w:val="0"/>
-          <w:sz w:val="24"/>
-          <w:szCs w:val="24"/>
+          <w:highlight w:val="yellow"/>
+          <w:lang w:eastAsia="fr-FR"/>
+          <w14:ligatures w14:val="none"/>
+        </w:rPr>
+      </w:pPr>
+      <w:proofErr w:type="spellStart"/>
+      <w:r>
+        <w:rPr>
+          <w:rFonts w:ascii="Times New Roman" w:eastAsia="Times New Roman" w:hAnsi="Times New Roman" w:cs="Times New Roman"/>
+          <w:kern w:val="0"/>
+          <w:sz w:val="24"/>
+          <w:szCs w:val="24"/>
+          <w:highlight w:val="yellow"/>
           <w:lang w:eastAsia="fr-FR"/>
           <w14:ligatures w14:val="none"/>
         </w:rPr>
         <w:t>ReLU</w:t>
       </w:r>
+      <w:proofErr w:type="spellEnd"/>
     </w:p>
     <w:p>
       <w:pPr>
@@ -584,21 +764,25 @@
           <w:kern w:val="0"/>
           <w:sz w:val="24"/>
           <w:szCs w:val="24"/>
-          <w:lang w:eastAsia="fr-FR"/>
-          <w14:ligatures w14:val="none"/>
-        </w:rPr>
-      </w:pPr>
-      <w:r>
-        <w:rPr>
-          <w:rFonts w:ascii="Times New Roman" w:eastAsia="Times New Roman" w:hAnsi="Times New Roman" w:cs="Times New Roman"/>
-          <w:kern w:val="0"/>
-          <w:sz w:val="24"/>
-          <w:szCs w:val="24"/>
+          <w:highlight w:val="yellow"/>
+          <w:lang w:eastAsia="fr-FR"/>
+          <w14:ligatures w14:val="none"/>
+        </w:rPr>
+      </w:pPr>
+      <w:proofErr w:type="spellStart"/>
+      <w:r>
+        <w:rPr>
+          <w:rFonts w:ascii="Times New Roman" w:eastAsia="Times New Roman" w:hAnsi="Times New Roman" w:cs="Times New Roman"/>
+          <w:kern w:val="0"/>
+          <w:sz w:val="24"/>
+          <w:szCs w:val="24"/>
+          <w:highlight w:val="yellow"/>
           <w:lang w:eastAsia="fr-FR"/>
           <w14:ligatures w14:val="none"/>
         </w:rPr>
         <w:t>Sigmoid</w:t>
       </w:r>
+      <w:proofErr w:type="spellEnd"/>
     </w:p>
     <w:p>
       <w:pPr>
@@ -612,16 +796,18 @@
           <w:kern w:val="0"/>
           <w:sz w:val="24"/>
           <w:szCs w:val="24"/>
-          <w:lang w:eastAsia="fr-FR"/>
-          <w14:ligatures w14:val="none"/>
-        </w:rPr>
-      </w:pPr>
-      <w:r>
-        <w:rPr>
-          <w:rFonts w:ascii="Times New Roman" w:eastAsia="Times New Roman" w:hAnsi="Times New Roman" w:cs="Times New Roman"/>
-          <w:kern w:val="0"/>
-          <w:sz w:val="24"/>
-          <w:szCs w:val="24"/>
+          <w:highlight w:val="yellow"/>
+          <w:lang w:eastAsia="fr-FR"/>
+          <w14:ligatures w14:val="none"/>
+        </w:rPr>
+      </w:pPr>
+      <w:r>
+        <w:rPr>
+          <w:rFonts w:ascii="Times New Roman" w:eastAsia="Times New Roman" w:hAnsi="Times New Roman" w:cs="Times New Roman"/>
+          <w:kern w:val="0"/>
+          <w:sz w:val="24"/>
+          <w:szCs w:val="24"/>
+          <w:highlight w:val="yellow"/>
           <w:lang w:eastAsia="fr-FR"/>
           <w14:ligatures w14:val="none"/>
         </w:rPr>
@@ -640,16 +826,18 @@
           <w:kern w:val="0"/>
           <w:sz w:val="24"/>
           <w:szCs w:val="24"/>
-          <w:lang w:eastAsia="fr-FR"/>
-          <w14:ligatures w14:val="none"/>
-        </w:rPr>
-      </w:pPr>
-      <w:r>
-        <w:rPr>
-          <w:rFonts w:ascii="Times New Roman" w:eastAsia="Times New Roman" w:hAnsi="Times New Roman" w:cs="Times New Roman"/>
-          <w:kern w:val="0"/>
-          <w:sz w:val="24"/>
-          <w:szCs w:val="24"/>
+          <w:highlight w:val="yellow"/>
+          <w:lang w:eastAsia="fr-FR"/>
+          <w14:ligatures w14:val="none"/>
+        </w:rPr>
+      </w:pPr>
+      <w:r>
+        <w:rPr>
+          <w:rFonts w:ascii="Times New Roman" w:eastAsia="Times New Roman" w:hAnsi="Times New Roman" w:cs="Times New Roman"/>
+          <w:kern w:val="0"/>
+          <w:sz w:val="24"/>
+          <w:szCs w:val="24"/>
+          <w:highlight w:val="yellow"/>
           <w:lang w:eastAsia="fr-FR"/>
           <w14:ligatures w14:val="none"/>
         </w:rPr>
@@ -668,16 +856,18 @@
           <w:kern w:val="0"/>
           <w:sz w:val="24"/>
           <w:szCs w:val="24"/>
-          <w:lang w:eastAsia="fr-FR"/>
-          <w14:ligatures w14:val="none"/>
-        </w:rPr>
-      </w:pPr>
-      <w:r>
-        <w:rPr>
-          <w:rFonts w:ascii="Times New Roman" w:eastAsia="Times New Roman" w:hAnsi="Times New Roman" w:cs="Times New Roman"/>
-          <w:kern w:val="0"/>
-          <w:sz w:val="24"/>
-          <w:szCs w:val="24"/>
+          <w:highlight w:val="yellow"/>
+          <w:lang w:eastAsia="fr-FR"/>
+          <w14:ligatures w14:val="none"/>
+        </w:rPr>
+      </w:pPr>
+      <w:r>
+        <w:rPr>
+          <w:rFonts w:ascii="Times New Roman" w:eastAsia="Times New Roman" w:hAnsi="Times New Roman" w:cs="Times New Roman"/>
+          <w:kern w:val="0"/>
+          <w:sz w:val="24"/>
+          <w:szCs w:val="24"/>
+          <w:highlight w:val="yellow"/>
           <w:lang w:eastAsia="fr-FR"/>
           <w14:ligatures w14:val="none"/>
         </w:rPr>
@@ -696,21 +886,37 @@
           <w:kern w:val="0"/>
           <w:sz w:val="24"/>
           <w:szCs w:val="24"/>
-          <w:lang w:eastAsia="fr-FR"/>
-          <w14:ligatures w14:val="none"/>
-        </w:rPr>
-      </w:pPr>
-      <w:r>
-        <w:rPr>
-          <w:rFonts w:ascii="Times New Roman" w:eastAsia="Times New Roman" w:hAnsi="Times New Roman" w:cs="Times New Roman"/>
-          <w:kern w:val="0"/>
-          <w:sz w:val="24"/>
-          <w:szCs w:val="24"/>
-          <w:lang w:eastAsia="fr-FR"/>
-          <w14:ligatures w14:val="none"/>
-        </w:rPr>
-        <w:t>Cross-Entropy</w:t>
-      </w:r>
+          <w:highlight w:val="yellow"/>
+          <w:lang w:eastAsia="fr-FR"/>
+          <w14:ligatures w14:val="none"/>
+        </w:rPr>
+      </w:pPr>
+      <w:r>
+        <w:rPr>
+          <w:rFonts w:ascii="Times New Roman" w:eastAsia="Times New Roman" w:hAnsi="Times New Roman" w:cs="Times New Roman"/>
+          <w:kern w:val="0"/>
+          <w:sz w:val="24"/>
+          <w:szCs w:val="24"/>
+          <w:highlight w:val="yellow"/>
+          <w:lang w:eastAsia="fr-FR"/>
+          <w14:ligatures w14:val="none"/>
+        </w:rPr>
+        <w:t>Cross-</w:t>
+      </w:r>
+      <w:proofErr w:type="spellStart"/>
+      <w:r>
+        <w:rPr>
+          <w:rFonts w:ascii="Times New Roman" w:eastAsia="Times New Roman" w:hAnsi="Times New Roman" w:cs="Times New Roman"/>
+          <w:kern w:val="0"/>
+          <w:sz w:val="24"/>
+          <w:szCs w:val="24"/>
+          <w:highlight w:val="yellow"/>
+          <w:lang w:eastAsia="fr-FR"/>
+          <w14:ligatures w14:val="none"/>
+        </w:rPr>
+        <w:t>Entropy</w:t>
+      </w:r>
+      <w:proofErr w:type="spellEnd"/>
     </w:p>
     <w:p>
       <w:pPr>
@@ -762,7 +968,140 @@
           <w:lang w:val="es-ES_tradnl" w:eastAsia="fr-FR"/>
           <w14:ligatures w14:val="none"/>
         </w:rPr>
-        <w:t xml:space="preserve">y=f(Wx+b)y = f(Wx + b)y=f(Wx+b) </w:t>
+        <w:t>y=f(</w:t>
+      </w:r>
+      <w:proofErr w:type="spellStart"/>
+      <w:r>
+        <w:rPr>
+          <w:rFonts w:ascii="Times New Roman" w:eastAsia="Times New Roman" w:hAnsi="Times New Roman" w:cs="Times New Roman"/>
+          <w:kern w:val="0"/>
+          <w:sz w:val="24"/>
+          <w:szCs w:val="24"/>
+          <w:lang w:val="es-ES_tradnl" w:eastAsia="fr-FR"/>
+          <w14:ligatures w14:val="none"/>
+        </w:rPr>
+        <w:t>Wx+</w:t>
+      </w:r>
+      <w:proofErr w:type="gramStart"/>
+      <w:r>
+        <w:rPr>
+          <w:rFonts w:ascii="Times New Roman" w:eastAsia="Times New Roman" w:hAnsi="Times New Roman" w:cs="Times New Roman"/>
+          <w:kern w:val="0"/>
+          <w:sz w:val="24"/>
+          <w:szCs w:val="24"/>
+          <w:lang w:val="es-ES_tradnl" w:eastAsia="fr-FR"/>
+          <w14:ligatures w14:val="none"/>
+        </w:rPr>
+        <w:t>b</w:t>
+      </w:r>
+      <w:proofErr w:type="spellEnd"/>
+      <w:r>
+        <w:rPr>
+          <w:rFonts w:ascii="Times New Roman" w:eastAsia="Times New Roman" w:hAnsi="Times New Roman" w:cs="Times New Roman"/>
+          <w:kern w:val="0"/>
+          <w:sz w:val="24"/>
+          <w:szCs w:val="24"/>
+          <w:lang w:val="es-ES_tradnl" w:eastAsia="fr-FR"/>
+          <w14:ligatures w14:val="none"/>
+        </w:rPr>
+        <w:t>)y</w:t>
+      </w:r>
+      <w:proofErr w:type="gramEnd"/>
+      <w:r>
+        <w:rPr>
+          <w:rFonts w:ascii="Times New Roman" w:eastAsia="Times New Roman" w:hAnsi="Times New Roman" w:cs="Times New Roman"/>
+          <w:kern w:val="0"/>
+          <w:sz w:val="24"/>
+          <w:szCs w:val="24"/>
+          <w:lang w:val="es-ES_tradnl" w:eastAsia="fr-FR"/>
+          <w14:ligatures w14:val="none"/>
+        </w:rPr>
+        <w:t xml:space="preserve"> = </w:t>
+      </w:r>
+      <w:proofErr w:type="gramStart"/>
+      <w:r>
+        <w:rPr>
+          <w:rFonts w:ascii="Times New Roman" w:eastAsia="Times New Roman" w:hAnsi="Times New Roman" w:cs="Times New Roman"/>
+          <w:kern w:val="0"/>
+          <w:sz w:val="24"/>
+          <w:szCs w:val="24"/>
+          <w:lang w:val="es-ES_tradnl" w:eastAsia="fr-FR"/>
+          <w14:ligatures w14:val="none"/>
+        </w:rPr>
+        <w:t>f(</w:t>
+      </w:r>
+      <w:proofErr w:type="spellStart"/>
+      <w:proofErr w:type="gramEnd"/>
+      <w:r>
+        <w:rPr>
+          <w:rFonts w:ascii="Times New Roman" w:eastAsia="Times New Roman" w:hAnsi="Times New Roman" w:cs="Times New Roman"/>
+          <w:kern w:val="0"/>
+          <w:sz w:val="24"/>
+          <w:szCs w:val="24"/>
+          <w:lang w:val="es-ES_tradnl" w:eastAsia="fr-FR"/>
+          <w14:ligatures w14:val="none"/>
+        </w:rPr>
+        <w:t>Wx</w:t>
+      </w:r>
+      <w:proofErr w:type="spellEnd"/>
+      <w:r>
+        <w:rPr>
+          <w:rFonts w:ascii="Times New Roman" w:eastAsia="Times New Roman" w:hAnsi="Times New Roman" w:cs="Times New Roman"/>
+          <w:kern w:val="0"/>
+          <w:sz w:val="24"/>
+          <w:szCs w:val="24"/>
+          <w:lang w:val="es-ES_tradnl" w:eastAsia="fr-FR"/>
+          <w14:ligatures w14:val="none"/>
+        </w:rPr>
+        <w:t xml:space="preserve"> + </w:t>
+      </w:r>
+      <w:proofErr w:type="gramStart"/>
+      <w:r>
+        <w:rPr>
+          <w:rFonts w:ascii="Times New Roman" w:eastAsia="Times New Roman" w:hAnsi="Times New Roman" w:cs="Times New Roman"/>
+          <w:kern w:val="0"/>
+          <w:sz w:val="24"/>
+          <w:szCs w:val="24"/>
+          <w:lang w:val="es-ES_tradnl" w:eastAsia="fr-FR"/>
+          <w14:ligatures w14:val="none"/>
+        </w:rPr>
+        <w:t>b)y</w:t>
+      </w:r>
+      <w:proofErr w:type="gramEnd"/>
+      <w:r>
+        <w:rPr>
+          <w:rFonts w:ascii="Times New Roman" w:eastAsia="Times New Roman" w:hAnsi="Times New Roman" w:cs="Times New Roman"/>
+          <w:kern w:val="0"/>
+          <w:sz w:val="24"/>
+          <w:szCs w:val="24"/>
+          <w:lang w:val="es-ES_tradnl" w:eastAsia="fr-FR"/>
+          <w14:ligatures w14:val="none"/>
+        </w:rPr>
+        <w:t>=f(</w:t>
+      </w:r>
+      <w:proofErr w:type="spellStart"/>
+      <w:r>
+        <w:rPr>
+          <w:rFonts w:ascii="Times New Roman" w:eastAsia="Times New Roman" w:hAnsi="Times New Roman" w:cs="Times New Roman"/>
+          <w:kern w:val="0"/>
+          <w:sz w:val="24"/>
+          <w:szCs w:val="24"/>
+          <w:lang w:val="es-ES_tradnl" w:eastAsia="fr-FR"/>
+          <w14:ligatures w14:val="none"/>
+        </w:rPr>
+        <w:t>Wx+b</w:t>
+      </w:r>
+      <w:proofErr w:type="spellEnd"/>
+      <w:r>
+        <w:rPr>
+          <w:rFonts w:ascii="Times New Roman" w:eastAsia="Times New Roman" w:hAnsi="Times New Roman" w:cs="Times New Roman"/>
+          <w:kern w:val="0"/>
+          <w:sz w:val="24"/>
+          <w:szCs w:val="24"/>
+          <w:lang w:val="es-ES_tradnl" w:eastAsia="fr-FR"/>
+          <w14:ligatures w14:val="none"/>
+        </w:rPr>
+        <w:t xml:space="preserve">) </w:t>
       </w:r>
     </w:p>
     <w:p>
@@ -838,7 +1177,55 @@
           <w:lang w:eastAsia="fr-FR"/>
           <w14:ligatures w14:val="none"/>
         </w:rPr>
-        <w:t>Calcul d’un neurone (forward + backward) à la main</w:t>
+        <w:t>Calcul d’un neurone (</w:t>
+      </w:r>
+      <w:proofErr w:type="spellStart"/>
+      <w:r>
+        <w:rPr>
+          <w:rFonts w:ascii="Times New Roman" w:eastAsia="Times New Roman" w:hAnsi="Times New Roman" w:cs="Times New Roman"/>
+          <w:kern w:val="0"/>
+          <w:sz w:val="24"/>
+          <w:szCs w:val="24"/>
+          <w:lang w:eastAsia="fr-FR"/>
+          <w14:ligatures w14:val="none"/>
+        </w:rPr>
+        <w:t>forward</w:t>
+      </w:r>
+      <w:proofErr w:type="spellEnd"/>
+      <w:r>
+        <w:rPr>
+          <w:rFonts w:ascii="Times New Roman" w:eastAsia="Times New Roman" w:hAnsi="Times New Roman" w:cs="Times New Roman"/>
+          <w:kern w:val="0"/>
+          <w:sz w:val="24"/>
+          <w:szCs w:val="24"/>
+          <w:lang w:eastAsia="fr-FR"/>
+          <w14:ligatures w14:val="none"/>
+        </w:rPr>
+        <w:t xml:space="preserve"> + </w:t>
+      </w:r>
+      <w:proofErr w:type="spellStart"/>
+      <w:r>
+        <w:rPr>
+          <w:rFonts w:ascii="Times New Roman" w:eastAsia="Times New Roman" w:hAnsi="Times New Roman" w:cs="Times New Roman"/>
+          <w:kern w:val="0"/>
+          <w:sz w:val="24"/>
+          <w:szCs w:val="24"/>
+          <w:lang w:eastAsia="fr-FR"/>
+          <w14:ligatures w14:val="none"/>
+        </w:rPr>
+        <w:t>backward</w:t>
+      </w:r>
+      <w:proofErr w:type="spellEnd"/>
+      <w:r>
+        <w:rPr>
+          <w:rFonts w:ascii="Times New Roman" w:eastAsia="Times New Roman" w:hAnsi="Times New Roman" w:cs="Times New Roman"/>
+          <w:kern w:val="0"/>
+          <w:sz w:val="24"/>
+          <w:szCs w:val="24"/>
+          <w:lang w:eastAsia="fr-FR"/>
+          <w14:ligatures w14:val="none"/>
+        </w:rPr>
+        <w:t>) à la main</w:t>
       </w:r>
     </w:p>
     <w:p>
@@ -894,7 +1281,35 @@
           <w14:ligatures w14:val="none"/>
         </w:rPr>
         <w:lastRenderedPageBreak/>
-        <w:t>4. Régression avec PyTorch (premier vrai modèle)</w:t>
+        <w:t xml:space="preserve">4. Régression avec </w:t>
+      </w:r>
+      <w:proofErr w:type="spellStart"/>
+      <w:r>
+        <w:rPr>
+          <w:rFonts w:ascii="Times New Roman" w:eastAsia="Times New Roman" w:hAnsi="Times New Roman" w:cs="Times New Roman"/>
+          <w:b/>
+          <w:bCs/>
+          <w:kern w:val="0"/>
+          <w:sz w:val="36"/>
+          <w:szCs w:val="36"/>
+          <w:lang w:eastAsia="fr-FR"/>
+          <w14:ligatures w14:val="none"/>
+        </w:rPr>
+        <w:t>PyTorch</w:t>
+      </w:r>
+      <w:proofErr w:type="spellEnd"/>
+      <w:r>
+        <w:rPr>
+          <w:rFonts w:ascii="Times New Roman" w:eastAsia="Times New Roman" w:hAnsi="Times New Roman" w:cs="Times New Roman"/>
+          <w:b/>
+          <w:bCs/>
+          <w:kern w:val="0"/>
+          <w:sz w:val="36"/>
+          <w:szCs w:val="36"/>
+          <w:lang w:eastAsia="fr-FR"/>
+          <w14:ligatures w14:val="none"/>
+        </w:rPr>
+        <w:t xml:space="preserve"> (premier vrai modèle)</w:t>
       </w:r>
     </w:p>
     <w:p>
@@ -938,16 +1353,18 @@
           <w:kern w:val="0"/>
           <w:sz w:val="24"/>
           <w:szCs w:val="24"/>
-          <w:lang w:eastAsia="fr-FR"/>
-          <w14:ligatures w14:val="none"/>
-        </w:rPr>
-      </w:pPr>
-      <w:r>
-        <w:rPr>
-          <w:rFonts w:ascii="Times New Roman" w:eastAsia="Times New Roman" w:hAnsi="Times New Roman" w:cs="Times New Roman"/>
-          <w:kern w:val="0"/>
-          <w:sz w:val="24"/>
-          <w:szCs w:val="24"/>
+          <w:highlight w:val="yellow"/>
+          <w:lang w:eastAsia="fr-FR"/>
+          <w14:ligatures w14:val="none"/>
+        </w:rPr>
+      </w:pPr>
+      <w:r>
+        <w:rPr>
+          <w:rFonts w:ascii="Times New Roman" w:eastAsia="Times New Roman" w:hAnsi="Times New Roman" w:cs="Times New Roman"/>
+          <w:kern w:val="0"/>
+          <w:sz w:val="24"/>
+          <w:szCs w:val="24"/>
+          <w:highlight w:val="yellow"/>
           <w:lang w:eastAsia="fr-FR"/>
           <w14:ligatures w14:val="none"/>
         </w:rPr>
@@ -966,16 +1383,18 @@
           <w:kern w:val="0"/>
           <w:sz w:val="24"/>
           <w:szCs w:val="24"/>
-          <w:lang w:eastAsia="fr-FR"/>
-          <w14:ligatures w14:val="none"/>
-        </w:rPr>
-      </w:pPr>
-      <w:r>
-        <w:rPr>
-          <w:rFonts w:ascii="Times New Roman" w:eastAsia="Times New Roman" w:hAnsi="Times New Roman" w:cs="Times New Roman"/>
-          <w:kern w:val="0"/>
-          <w:sz w:val="24"/>
-          <w:szCs w:val="24"/>
+          <w:highlight w:val="yellow"/>
+          <w:lang w:eastAsia="fr-FR"/>
+          <w14:ligatures w14:val="none"/>
+        </w:rPr>
+      </w:pPr>
+      <w:r>
+        <w:rPr>
+          <w:rFonts w:ascii="Times New Roman" w:eastAsia="Times New Roman" w:hAnsi="Times New Roman" w:cs="Times New Roman"/>
+          <w:kern w:val="0"/>
+          <w:sz w:val="24"/>
+          <w:szCs w:val="24"/>
+          <w:highlight w:val="yellow"/>
           <w:lang w:eastAsia="fr-FR"/>
           <w14:ligatures w14:val="none"/>
         </w:rPr>
@@ -994,21 +1413,37 @@
           <w:kern w:val="0"/>
           <w:sz w:val="24"/>
           <w:szCs w:val="24"/>
-          <w:lang w:eastAsia="fr-FR"/>
-          <w14:ligatures w14:val="none"/>
-        </w:rPr>
-      </w:pPr>
-      <w:r>
-        <w:rPr>
-          <w:rFonts w:ascii="Times New Roman" w:eastAsia="Times New Roman" w:hAnsi="Times New Roman" w:cs="Times New Roman"/>
-          <w:kern w:val="0"/>
-          <w:sz w:val="24"/>
-          <w:szCs w:val="24"/>
-          <w:lang w:eastAsia="fr-FR"/>
-          <w14:ligatures w14:val="none"/>
-        </w:rPr>
-        <w:t>Loss function</w:t>
-      </w:r>
+          <w:highlight w:val="yellow"/>
+          <w:lang w:eastAsia="fr-FR"/>
+          <w14:ligatures w14:val="none"/>
+        </w:rPr>
+      </w:pPr>
+      <w:r>
+        <w:rPr>
+          <w:rFonts w:ascii="Times New Roman" w:eastAsia="Times New Roman" w:hAnsi="Times New Roman" w:cs="Times New Roman"/>
+          <w:kern w:val="0"/>
+          <w:sz w:val="24"/>
+          <w:szCs w:val="24"/>
+          <w:highlight w:val="yellow"/>
+          <w:lang w:eastAsia="fr-FR"/>
+          <w14:ligatures w14:val="none"/>
+        </w:rPr>
+        <w:t xml:space="preserve">Loss </w:t>
+      </w:r>
+      <w:proofErr w:type="spellStart"/>
+      <w:r>
+        <w:rPr>
+          <w:rFonts w:ascii="Times New Roman" w:eastAsia="Times New Roman" w:hAnsi="Times New Roman" w:cs="Times New Roman"/>
+          <w:kern w:val="0"/>
+          <w:sz w:val="24"/>
+          <w:szCs w:val="24"/>
+          <w:highlight w:val="yellow"/>
+          <w:lang w:eastAsia="fr-FR"/>
+          <w14:ligatures w14:val="none"/>
+        </w:rPr>
+        <w:t>function</w:t>
+      </w:r>
+      <w:proofErr w:type="spellEnd"/>
     </w:p>
     <w:p>
       <w:pPr>
@@ -1069,6 +1504,7 @@
           <w14:ligatures w14:val="none"/>
         </w:rPr>
       </w:pPr>
+      <w:proofErr w:type="gramStart"/>
       <w:r>
         <w:rPr>
           <w:rFonts w:ascii="Courier New" w:eastAsia="Times New Roman" w:hAnsi="Courier New" w:cs="Courier New"/>
@@ -1078,8 +1514,59 @@
           <w:lang w:eastAsia="fr-FR"/>
           <w14:ligatures w14:val="none"/>
         </w:rPr>
-        <w:t>import torch.nn as nn</w:t>
-      </w:r>
+        <w:t>import</w:t>
+      </w:r>
+      <w:proofErr w:type="gramEnd"/>
+      <w:r>
+        <w:rPr>
+          <w:rFonts w:ascii="Courier New" w:eastAsia="Times New Roman" w:hAnsi="Courier New" w:cs="Courier New"/>
+          <w:kern w:val="0"/>
+          <w:sz w:val="20"/>
+          <w:szCs w:val="20"/>
+          <w:lang w:eastAsia="fr-FR"/>
+          <w14:ligatures w14:val="none"/>
+        </w:rPr>
+        <w:t xml:space="preserve"> </w:t>
+      </w:r>
+      <w:proofErr w:type="spellStart"/>
+      <w:proofErr w:type="gramStart"/>
+      <w:r>
+        <w:rPr>
+          <w:rFonts w:ascii="Courier New" w:eastAsia="Times New Roman" w:hAnsi="Courier New" w:cs="Courier New"/>
+          <w:kern w:val="0"/>
+          <w:sz w:val="20"/>
+          <w:szCs w:val="20"/>
+          <w:lang w:eastAsia="fr-FR"/>
+          <w14:ligatures w14:val="none"/>
+        </w:rPr>
+        <w:t>torch.nn</w:t>
+      </w:r>
+      <w:proofErr w:type="spellEnd"/>
+      <w:proofErr w:type="gramEnd"/>
+      <w:r>
+        <w:rPr>
+          <w:rFonts w:ascii="Courier New" w:eastAsia="Times New Roman" w:hAnsi="Courier New" w:cs="Courier New"/>
+          <w:kern w:val="0"/>
+          <w:sz w:val="20"/>
+          <w:szCs w:val="20"/>
+          <w:lang w:eastAsia="fr-FR"/>
+          <w14:ligatures w14:val="none"/>
+        </w:rPr>
+        <w:t xml:space="preserve"> as </w:t>
+      </w:r>
+      <w:proofErr w:type="spellStart"/>
+      <w:r>
+        <w:rPr>
+          <w:rFonts w:ascii="Courier New" w:eastAsia="Times New Roman" w:hAnsi="Courier New" w:cs="Courier New"/>
+          <w:kern w:val="0"/>
+          <w:sz w:val="20"/>
+          <w:szCs w:val="20"/>
+          <w:lang w:eastAsia="fr-FR"/>
+          <w14:ligatures w14:val="none"/>
+        </w:rPr>
+        <w:t>nn</w:t>
+      </w:r>
+      <w:proofErr w:type="spellEnd"/>
     </w:p>
     <w:p>
       <w:pPr>
@@ -1142,6 +1629,7 @@
           <w14:ligatures w14:val="none"/>
         </w:rPr>
       </w:pPr>
+      <w:proofErr w:type="gramStart"/>
       <w:r>
         <w:rPr>
           <w:rFonts w:ascii="Courier New" w:eastAsia="Times New Roman" w:hAnsi="Courier New" w:cs="Courier New"/>
@@ -1151,7 +1639,45 @@
           <w:lang w:eastAsia="fr-FR"/>
           <w14:ligatures w14:val="none"/>
         </w:rPr>
-        <w:t>model = nn.Linear(1, 1)</w:t>
+        <w:t>model</w:t>
+      </w:r>
+      <w:proofErr w:type="gramEnd"/>
+      <w:r>
+        <w:rPr>
+          <w:rFonts w:ascii="Courier New" w:eastAsia="Times New Roman" w:hAnsi="Courier New" w:cs="Courier New"/>
+          <w:kern w:val="0"/>
+          <w:sz w:val="20"/>
+          <w:szCs w:val="20"/>
+          <w:lang w:eastAsia="fr-FR"/>
+          <w14:ligatures w14:val="none"/>
+        </w:rPr>
+        <w:t xml:space="preserve"> = </w:t>
+      </w:r>
+      <w:proofErr w:type="spellStart"/>
+      <w:proofErr w:type="gramStart"/>
+      <w:r>
+        <w:rPr>
+          <w:rFonts w:ascii="Courier New" w:eastAsia="Times New Roman" w:hAnsi="Courier New" w:cs="Courier New"/>
+          <w:kern w:val="0"/>
+          <w:sz w:val="20"/>
+          <w:szCs w:val="20"/>
+          <w:lang w:eastAsia="fr-FR"/>
+          <w14:ligatures w14:val="none"/>
+        </w:rPr>
+        <w:t>nn.Linear</w:t>
+      </w:r>
+      <w:proofErr w:type="spellEnd"/>
+      <w:proofErr w:type="gramEnd"/>
+      <w:r>
+        <w:rPr>
+          <w:rFonts w:ascii="Courier New" w:eastAsia="Times New Roman" w:hAnsi="Courier New" w:cs="Courier New"/>
+          <w:kern w:val="0"/>
+          <w:sz w:val="20"/>
+          <w:szCs w:val="20"/>
+          <w:lang w:eastAsia="fr-FR"/>
+          <w14:ligatures w14:val="none"/>
+        </w:rPr>
+        <w:t>(1, 1)</w:t>
       </w:r>
     </w:p>
     <w:p>
@@ -1184,6 +1710,8 @@
           <w14:ligatures w14:val="none"/>
         </w:rPr>
       </w:pPr>
+      <w:proofErr w:type="spellStart"/>
+      <w:proofErr w:type="gramStart"/>
       <w:r>
         <w:rPr>
           <w:rFonts w:ascii="Courier New" w:eastAsia="Times New Roman" w:hAnsi="Courier New" w:cs="Courier New"/>
@@ -1193,7 +1721,46 @@
           <w:lang w:eastAsia="fr-FR"/>
           <w14:ligatures w14:val="none"/>
         </w:rPr>
-        <w:t>criterion = nn.MSELoss()</w:t>
+        <w:t>criterion</w:t>
+      </w:r>
+      <w:proofErr w:type="spellEnd"/>
+      <w:proofErr w:type="gramEnd"/>
+      <w:r>
+        <w:rPr>
+          <w:rFonts w:ascii="Courier New" w:eastAsia="Times New Roman" w:hAnsi="Courier New" w:cs="Courier New"/>
+          <w:kern w:val="0"/>
+          <w:sz w:val="20"/>
+          <w:szCs w:val="20"/>
+          <w:lang w:eastAsia="fr-FR"/>
+          <w14:ligatures w14:val="none"/>
+        </w:rPr>
+        <w:t xml:space="preserve"> = </w:t>
+      </w:r>
+      <w:proofErr w:type="spellStart"/>
+      <w:proofErr w:type="gramStart"/>
+      <w:r>
+        <w:rPr>
+          <w:rFonts w:ascii="Courier New" w:eastAsia="Times New Roman" w:hAnsi="Courier New" w:cs="Courier New"/>
+          <w:kern w:val="0"/>
+          <w:sz w:val="20"/>
+          <w:szCs w:val="20"/>
+          <w:lang w:eastAsia="fr-FR"/>
+          <w14:ligatures w14:val="none"/>
+        </w:rPr>
+        <w:t>nn.MSELoss</w:t>
+      </w:r>
+      <w:proofErr w:type="spellEnd"/>
+      <w:proofErr w:type="gramEnd"/>
+      <w:r>
+        <w:rPr>
+          <w:rFonts w:ascii="Courier New" w:eastAsia="Times New Roman" w:hAnsi="Courier New" w:cs="Courier New"/>
+          <w:kern w:val="0"/>
+          <w:sz w:val="20"/>
+          <w:szCs w:val="20"/>
+          <w:lang w:eastAsia="fr-FR"/>
+          <w14:ligatures w14:val="none"/>
+        </w:rPr>
+        <w:t>()</w:t>
       </w:r>
     </w:p>
     <w:p>
@@ -1235,7 +1802,81 @@
           <w:lang w:val="en-US" w:eastAsia="fr-FR"/>
           <w14:ligatures w14:val="none"/>
         </w:rPr>
-        <w:t>optimizer = torch.optim.SGD(model.parameters(), lr=0.01)</w:t>
+        <w:t xml:space="preserve">optimizer = </w:t>
+      </w:r>
+      <w:proofErr w:type="spellStart"/>
+      <w:r>
+        <w:rPr>
+          <w:rFonts w:ascii="Courier New" w:eastAsia="Times New Roman" w:hAnsi="Courier New" w:cs="Courier New"/>
+          <w:kern w:val="0"/>
+          <w:sz w:val="20"/>
+          <w:szCs w:val="20"/>
+          <w:lang w:val="en-US" w:eastAsia="fr-FR"/>
+          <w14:ligatures w14:val="none"/>
+        </w:rPr>
+        <w:t>torch.optim.SGD</w:t>
+      </w:r>
+      <w:proofErr w:type="spellEnd"/>
+      <w:r>
+        <w:rPr>
+          <w:rFonts w:ascii="Courier New" w:eastAsia="Times New Roman" w:hAnsi="Courier New" w:cs="Courier New"/>
+          <w:kern w:val="0"/>
+          <w:sz w:val="20"/>
+          <w:szCs w:val="20"/>
+          <w:lang w:val="en-US" w:eastAsia="fr-FR"/>
+          <w14:ligatures w14:val="none"/>
+        </w:rPr>
+        <w:t>(</w:t>
+      </w:r>
+      <w:proofErr w:type="spellStart"/>
+      <w:proofErr w:type="gramStart"/>
+      <w:r>
+        <w:rPr>
+          <w:rFonts w:ascii="Courier New" w:eastAsia="Times New Roman" w:hAnsi="Courier New" w:cs="Courier New"/>
+          <w:kern w:val="0"/>
+          <w:sz w:val="20"/>
+          <w:szCs w:val="20"/>
+          <w:lang w:val="en-US" w:eastAsia="fr-FR"/>
+          <w14:ligatures w14:val="none"/>
+        </w:rPr>
+        <w:t>model.parameters</w:t>
+      </w:r>
+      <w:proofErr w:type="spellEnd"/>
+      <w:proofErr w:type="gramEnd"/>
+      <w:r>
+        <w:rPr>
+          <w:rFonts w:ascii="Courier New" w:eastAsia="Times New Roman" w:hAnsi="Courier New" w:cs="Courier New"/>
+          <w:kern w:val="0"/>
+          <w:sz w:val="20"/>
+          <w:szCs w:val="20"/>
+          <w:lang w:val="en-US" w:eastAsia="fr-FR"/>
+          <w14:ligatures w14:val="none"/>
+        </w:rPr>
+        <w:t xml:space="preserve">(), </w:t>
+      </w:r>
+      <w:proofErr w:type="spellStart"/>
+      <w:r>
+        <w:rPr>
+          <w:rFonts w:ascii="Courier New" w:eastAsia="Times New Roman" w:hAnsi="Courier New" w:cs="Courier New"/>
+          <w:kern w:val="0"/>
+          <w:sz w:val="20"/>
+          <w:szCs w:val="20"/>
+          <w:lang w:val="en-US" w:eastAsia="fr-FR"/>
+          <w14:ligatures w14:val="none"/>
+        </w:rPr>
+        <w:t>lr</w:t>
+      </w:r>
+      <w:proofErr w:type="spellEnd"/>
+      <w:r>
+        <w:rPr>
+          <w:rFonts w:ascii="Courier New" w:eastAsia="Times New Roman" w:hAnsi="Courier New" w:cs="Courier New"/>
+          <w:kern w:val="0"/>
+          <w:sz w:val="20"/>
+          <w:szCs w:val="20"/>
+          <w:lang w:val="en-US" w:eastAsia="fr-FR"/>
+          <w14:ligatures w14:val="none"/>
+        </w:rPr>
+        <w:t>=0.01)</w:t>
       </w:r>
     </w:p>
     <w:p>
@@ -1264,8 +1905,23 @@
           <w:lang w:val="en-US" w:eastAsia="fr-FR"/>
           <w14:ligatures w14:val="none"/>
         </w:rPr>
-        <w:t>Boucle d’entraînement</w:t>
-      </w:r>
+        <w:t xml:space="preserve">Boucle </w:t>
+      </w:r>
+      <w:proofErr w:type="spellStart"/>
+      <w:r>
+        <w:rPr>
+          <w:rFonts w:ascii="Times New Roman" w:eastAsia="Times New Roman" w:hAnsi="Times New Roman" w:cs="Times New Roman"/>
+          <w:b/>
+          <w:bCs/>
+          <w:kern w:val="0"/>
+          <w:sz w:val="27"/>
+          <w:szCs w:val="27"/>
+          <w:lang w:val="en-US" w:eastAsia="fr-FR"/>
+          <w14:ligatures w14:val="none"/>
+        </w:rPr>
+        <w:t>d’entraînement</w:t>
+      </w:r>
+      <w:proofErr w:type="spellEnd"/>
     </w:p>
     <w:p>
       <w:pPr>
@@ -1306,7 +1962,31 @@
           <w:lang w:val="en-US" w:eastAsia="fr-FR"/>
           <w14:ligatures w14:val="none"/>
         </w:rPr>
-        <w:t>for epoch in range(100):</w:t>
+        <w:t xml:space="preserve">for epoch in </w:t>
+      </w:r>
+      <w:proofErr w:type="gramStart"/>
+      <w:r>
+        <w:rPr>
+          <w:rFonts w:ascii="Courier New" w:eastAsia="Times New Roman" w:hAnsi="Courier New" w:cs="Courier New"/>
+          <w:kern w:val="0"/>
+          <w:sz w:val="20"/>
+          <w:szCs w:val="20"/>
+          <w:lang w:val="en-US" w:eastAsia="fr-FR"/>
+          <w14:ligatures w14:val="none"/>
+        </w:rPr>
+        <w:t>range(</w:t>
+      </w:r>
+      <w:proofErr w:type="gramEnd"/>
+      <w:r>
+        <w:rPr>
+          <w:rFonts w:ascii="Courier New" w:eastAsia="Times New Roman" w:hAnsi="Courier New" w:cs="Courier New"/>
+          <w:kern w:val="0"/>
+          <w:sz w:val="20"/>
+          <w:szCs w:val="20"/>
+          <w:lang w:val="en-US" w:eastAsia="fr-FR"/>
+          <w14:ligatures w14:val="none"/>
+        </w:rPr>
+        <w:t>100):</w:t>
       </w:r>
     </w:p>
     <w:p>
@@ -1348,7 +2028,68 @@
           <w:lang w:val="en-US" w:eastAsia="fr-FR"/>
           <w14:ligatures w14:val="none"/>
         </w:rPr>
-        <w:t xml:space="preserve">    optimizer.zero_grad()</w:t>
+        <w:t xml:space="preserve">    </w:t>
+      </w:r>
+      <w:proofErr w:type="spellStart"/>
+      <w:proofErr w:type="gramStart"/>
+      <w:r>
+        <w:rPr>
+          <w:rFonts w:ascii="Courier New" w:eastAsia="Times New Roman" w:hAnsi="Courier New" w:cs="Courier New"/>
+          <w:kern w:val="0"/>
+          <w:sz w:val="20"/>
+          <w:szCs w:val="20"/>
+          <w:lang w:val="en-US" w:eastAsia="fr-FR"/>
+          <w14:ligatures w14:val="none"/>
+        </w:rPr>
+        <w:t>optimizer.zero</w:t>
+      </w:r>
+      <w:proofErr w:type="gramEnd"/>
+      <w:r>
+        <w:rPr>
+          <w:rFonts w:ascii="Courier New" w:eastAsia="Times New Roman" w:hAnsi="Courier New" w:cs="Courier New"/>
+          <w:kern w:val="0"/>
+          <w:sz w:val="20"/>
+          <w:szCs w:val="20"/>
+          <w:lang w:val="en-US" w:eastAsia="fr-FR"/>
+          <w14:ligatures w14:val="none"/>
+        </w:rPr>
+        <w:t>_</w:t>
+      </w:r>
+      <w:proofErr w:type="gramStart"/>
+      <w:r>
+        <w:rPr>
+          <w:rFonts w:ascii="Courier New" w:eastAsia="Times New Roman" w:hAnsi="Courier New" w:cs="Courier New"/>
+          <w:kern w:val="0"/>
+          <w:sz w:val="20"/>
+          <w:szCs w:val="20"/>
+          <w:lang w:val="en-US" w:eastAsia="fr-FR"/>
+          <w14:ligatures w14:val="none"/>
+        </w:rPr>
+        <w:t>grad</w:t>
+      </w:r>
+      <w:proofErr w:type="spellEnd"/>
+      <w:r>
+        <w:rPr>
+          <w:rFonts w:ascii="Courier New" w:eastAsia="Times New Roman" w:hAnsi="Courier New" w:cs="Courier New"/>
+          <w:kern w:val="0"/>
+          <w:sz w:val="20"/>
+          <w:szCs w:val="20"/>
+          <w:lang w:val="en-US" w:eastAsia="fr-FR"/>
+          <w14:ligatures w14:val="none"/>
+        </w:rPr>
+        <w:t>(</w:t>
+      </w:r>
+      <w:proofErr w:type="gramEnd"/>
+      <w:r>
+        <w:rPr>
+          <w:rFonts w:ascii="Courier New" w:eastAsia="Times New Roman" w:hAnsi="Courier New" w:cs="Courier New"/>
+          <w:kern w:val="0"/>
+          <w:sz w:val="20"/>
+          <w:szCs w:val="20"/>
+          <w:lang w:val="en-US" w:eastAsia="fr-FR"/>
+          <w14:ligatures w14:val="none"/>
+        </w:rPr>
+        <w:t>)</w:t>
       </w:r>
     </w:p>
     <w:p>
@@ -1432,7 +2173,31 @@
           <w:lang w:val="en-US" w:eastAsia="fr-FR"/>
           <w14:ligatures w14:val="none"/>
         </w:rPr>
-        <w:t xml:space="preserve">    loss = criterion(outputs, y)</w:t>
+        <w:t xml:space="preserve">    loss = </w:t>
+      </w:r>
+      <w:proofErr w:type="gramStart"/>
+      <w:r>
+        <w:rPr>
+          <w:rFonts w:ascii="Courier New" w:eastAsia="Times New Roman" w:hAnsi="Courier New" w:cs="Courier New"/>
+          <w:kern w:val="0"/>
+          <w:sz w:val="20"/>
+          <w:szCs w:val="20"/>
+          <w:lang w:val="en-US" w:eastAsia="fr-FR"/>
+          <w14:ligatures w14:val="none"/>
+        </w:rPr>
+        <w:t>criterion(</w:t>
+      </w:r>
+      <w:proofErr w:type="gramEnd"/>
+      <w:r>
+        <w:rPr>
+          <w:rFonts w:ascii="Courier New" w:eastAsia="Times New Roman" w:hAnsi="Courier New" w:cs="Courier New"/>
+          <w:kern w:val="0"/>
+          <w:sz w:val="20"/>
+          <w:szCs w:val="20"/>
+          <w:lang w:val="en-US" w:eastAsia="fr-FR"/>
+          <w14:ligatures w14:val="none"/>
+        </w:rPr>
+        <w:t>outputs, y)</w:t>
       </w:r>
     </w:p>
     <w:p>
@@ -1474,7 +2239,33 @@
           <w:lang w:val="en-US" w:eastAsia="fr-FR"/>
           <w14:ligatures w14:val="none"/>
         </w:rPr>
-        <w:t xml:space="preserve">    loss.backward()</w:t>
+        <w:t xml:space="preserve">    </w:t>
+      </w:r>
+      <w:proofErr w:type="spellStart"/>
+      <w:proofErr w:type="gramStart"/>
+      <w:r>
+        <w:rPr>
+          <w:rFonts w:ascii="Courier New" w:eastAsia="Times New Roman" w:hAnsi="Courier New" w:cs="Courier New"/>
+          <w:kern w:val="0"/>
+          <w:sz w:val="20"/>
+          <w:szCs w:val="20"/>
+          <w:lang w:val="en-US" w:eastAsia="fr-FR"/>
+          <w14:ligatures w14:val="none"/>
+        </w:rPr>
+        <w:t>loss.backward</w:t>
+      </w:r>
+      <w:proofErr w:type="spellEnd"/>
+      <w:proofErr w:type="gramEnd"/>
+      <w:r>
+        <w:rPr>
+          <w:rFonts w:ascii="Courier New" w:eastAsia="Times New Roman" w:hAnsi="Courier New" w:cs="Courier New"/>
+          <w:kern w:val="0"/>
+          <w:sz w:val="20"/>
+          <w:szCs w:val="20"/>
+          <w:lang w:val="en-US" w:eastAsia="fr-FR"/>
+          <w14:ligatures w14:val="none"/>
+        </w:rPr>
+        <w:t>()</w:t>
       </w:r>
     </w:p>
     <w:p>
@@ -1516,7 +2307,33 @@
           <w:lang w:val="en-US" w:eastAsia="fr-FR"/>
           <w14:ligatures w14:val="none"/>
         </w:rPr>
-        <w:t xml:space="preserve">    optimizer.step()</w:t>
+        <w:t xml:space="preserve">    </w:t>
+      </w:r>
+      <w:proofErr w:type="spellStart"/>
+      <w:proofErr w:type="gramStart"/>
+      <w:r>
+        <w:rPr>
+          <w:rFonts w:ascii="Courier New" w:eastAsia="Times New Roman" w:hAnsi="Courier New" w:cs="Courier New"/>
+          <w:kern w:val="0"/>
+          <w:sz w:val="20"/>
+          <w:szCs w:val="20"/>
+          <w:lang w:val="en-US" w:eastAsia="fr-FR"/>
+          <w14:ligatures w14:val="none"/>
+        </w:rPr>
+        <w:t>optimizer.step</w:t>
+      </w:r>
+      <w:proofErr w:type="spellEnd"/>
+      <w:proofErr w:type="gramEnd"/>
+      <w:r>
+        <w:rPr>
+          <w:rFonts w:ascii="Courier New" w:eastAsia="Times New Roman" w:hAnsi="Courier New" w:cs="Courier New"/>
+          <w:kern w:val="0"/>
+          <w:sz w:val="20"/>
+          <w:szCs w:val="20"/>
+          <w:lang w:val="en-US" w:eastAsia="fr-FR"/>
+          <w14:ligatures w14:val="none"/>
+        </w:rPr>
+        <w:t>()</w:t>
       </w:r>
     </w:p>
     <w:p>
@@ -1545,8 +2362,23 @@
           <w:lang w:val="en-US" w:eastAsia="fr-FR"/>
           <w14:ligatures w14:val="none"/>
         </w:rPr>
-        <w:t>Concepts clés</w:t>
-      </w:r>
+        <w:t xml:space="preserve">Concepts </w:t>
+      </w:r>
+      <w:proofErr w:type="spellStart"/>
+      <w:r>
+        <w:rPr>
+          <w:rFonts w:ascii="Times New Roman" w:eastAsia="Times New Roman" w:hAnsi="Times New Roman" w:cs="Times New Roman"/>
+          <w:b/>
+          <w:bCs/>
+          <w:kern w:val="0"/>
+          <w:sz w:val="27"/>
+          <w:szCs w:val="27"/>
+          <w:lang w:val="en-US" w:eastAsia="fr-FR"/>
+          <w14:ligatures w14:val="none"/>
+        </w:rPr>
+        <w:t>clés</w:t>
+      </w:r>
+      <w:proofErr w:type="spellEnd"/>
     </w:p>
     <w:p>
       <w:pPr>
@@ -1564,6 +2396,8 @@
           <w14:ligatures w14:val="none"/>
         </w:rPr>
       </w:pPr>
+      <w:proofErr w:type="spellStart"/>
+      <w:proofErr w:type="gramStart"/>
       <w:r>
         <w:rPr>
           <w:rFonts w:ascii="Courier New" w:eastAsia="Times New Roman" w:hAnsi="Courier New" w:cs="Courier New"/>
@@ -1575,6 +2409,8 @@
         </w:rPr>
         <w:t>nn.Module</w:t>
       </w:r>
+      <w:proofErr w:type="spellEnd"/>
+      <w:proofErr w:type="gramEnd"/>
     </w:p>
     <w:p>
       <w:pPr>
@@ -1592,6 +2428,8 @@
           <w14:ligatures w14:val="none"/>
         </w:rPr>
       </w:pPr>
+      <w:proofErr w:type="spellStart"/>
+      <w:proofErr w:type="gramStart"/>
       <w:r>
         <w:rPr>
           <w:rFonts w:ascii="Courier New" w:eastAsia="Times New Roman" w:hAnsi="Courier New" w:cs="Courier New"/>
@@ -1601,7 +2439,20 @@
           <w:lang w:eastAsia="fr-FR"/>
           <w14:ligatures w14:val="none"/>
         </w:rPr>
-        <w:t>loss.backward()</w:t>
+        <w:t>loss.backward</w:t>
+      </w:r>
+      <w:proofErr w:type="spellEnd"/>
+      <w:proofErr w:type="gramEnd"/>
+      <w:r>
+        <w:rPr>
+          <w:rFonts w:ascii="Courier New" w:eastAsia="Times New Roman" w:hAnsi="Courier New" w:cs="Courier New"/>
+          <w:kern w:val="0"/>
+          <w:sz w:val="20"/>
+          <w:szCs w:val="20"/>
+          <w:lang w:eastAsia="fr-FR"/>
+          <w14:ligatures w14:val="none"/>
+        </w:rPr>
+        <w:t>()</w:t>
       </w:r>
     </w:p>
     <w:p>
@@ -1620,6 +2471,8 @@
           <w14:ligatures w14:val="none"/>
         </w:rPr>
       </w:pPr>
+      <w:proofErr w:type="spellStart"/>
+      <w:proofErr w:type="gramStart"/>
       <w:r>
         <w:rPr>
           <w:rFonts w:ascii="Courier New" w:eastAsia="Times New Roman" w:hAnsi="Courier New" w:cs="Courier New"/>
@@ -1629,7 +2482,20 @@
           <w:lang w:eastAsia="fr-FR"/>
           <w14:ligatures w14:val="none"/>
         </w:rPr>
-        <w:t>optimizer.step()</w:t>
+        <w:t>optimizer.step</w:t>
+      </w:r>
+      <w:proofErr w:type="spellEnd"/>
+      <w:proofErr w:type="gramEnd"/>
+      <w:r>
+        <w:rPr>
+          <w:rFonts w:ascii="Courier New" w:eastAsia="Times New Roman" w:hAnsi="Courier New" w:cs="Courier New"/>
+          <w:kern w:val="0"/>
+          <w:sz w:val="20"/>
+          <w:szCs w:val="20"/>
+          <w:lang w:eastAsia="fr-FR"/>
+          <w14:ligatures w14:val="none"/>
+        </w:rPr>
+        <w:t>()</w:t>
       </w:r>
     </w:p>
     <w:p>
@@ -1705,7 +2571,31 @@
           <w:lang w:eastAsia="fr-FR"/>
           <w14:ligatures w14:val="none"/>
         </w:rPr>
-        <w:t>Changer learning rate</w:t>
+        <w:t xml:space="preserve">Changer </w:t>
+      </w:r>
+      <w:proofErr w:type="spellStart"/>
+      <w:r>
+        <w:rPr>
+          <w:rFonts w:ascii="Times New Roman" w:eastAsia="Times New Roman" w:hAnsi="Times New Roman" w:cs="Times New Roman"/>
+          <w:kern w:val="0"/>
+          <w:sz w:val="24"/>
+          <w:szCs w:val="24"/>
+          <w:lang w:eastAsia="fr-FR"/>
+          <w14:ligatures w14:val="none"/>
+        </w:rPr>
+        <w:t>learning</w:t>
+      </w:r>
+      <w:proofErr w:type="spellEnd"/>
+      <w:r>
+        <w:rPr>
+          <w:rFonts w:ascii="Times New Roman" w:eastAsia="Times New Roman" w:hAnsi="Times New Roman" w:cs="Times New Roman"/>
+          <w:kern w:val="0"/>
+          <w:sz w:val="24"/>
+          <w:szCs w:val="24"/>
+          <w:lang w:eastAsia="fr-FR"/>
+          <w14:ligatures w14:val="none"/>
+        </w:rPr>
+        <w:t xml:space="preserve"> rate</w:t>
       </w:r>
     </w:p>
     <w:p>
@@ -1816,7 +2706,35 @@
           <w:lang w:eastAsia="fr-FR"/>
           <w14:ligatures w14:val="none"/>
         </w:rPr>
-        <w:t>5. Réseaux fully-connected (MLP)</w:t>
+        <w:t xml:space="preserve">5. Réseaux </w:t>
+      </w:r>
+      <w:proofErr w:type="spellStart"/>
+      <w:r>
+        <w:rPr>
+          <w:rFonts w:ascii="Times New Roman" w:eastAsia="Times New Roman" w:hAnsi="Times New Roman" w:cs="Times New Roman"/>
+          <w:b/>
+          <w:bCs/>
+          <w:kern w:val="0"/>
+          <w:sz w:val="36"/>
+          <w:szCs w:val="36"/>
+          <w:lang w:eastAsia="fr-FR"/>
+          <w14:ligatures w14:val="none"/>
+        </w:rPr>
+        <w:t>fully-connected</w:t>
+      </w:r>
+      <w:proofErr w:type="spellEnd"/>
+      <w:r>
+        <w:rPr>
+          <w:rFonts w:ascii="Times New Roman" w:eastAsia="Times New Roman" w:hAnsi="Times New Roman" w:cs="Times New Roman"/>
+          <w:b/>
+          <w:bCs/>
+          <w:kern w:val="0"/>
+          <w:sz w:val="36"/>
+          <w:szCs w:val="36"/>
+          <w:lang w:eastAsia="fr-FR"/>
+          <w14:ligatures w14:val="none"/>
+        </w:rPr>
+        <w:t xml:space="preserve"> (MLP)</w:t>
       </w:r>
     </w:p>
     <w:p>
@@ -1860,16 +2778,18 @@
           <w:kern w:val="0"/>
           <w:sz w:val="24"/>
           <w:szCs w:val="24"/>
-          <w:lang w:eastAsia="fr-FR"/>
-          <w14:ligatures w14:val="none"/>
-        </w:rPr>
-      </w:pPr>
-      <w:r>
-        <w:rPr>
-          <w:rFonts w:ascii="Times New Roman" w:eastAsia="Times New Roman" w:hAnsi="Times New Roman" w:cs="Times New Roman"/>
-          <w:kern w:val="0"/>
-          <w:sz w:val="24"/>
-          <w:szCs w:val="24"/>
+          <w:highlight w:val="yellow"/>
+          <w:lang w:eastAsia="fr-FR"/>
+          <w14:ligatures w14:val="none"/>
+        </w:rPr>
+      </w:pPr>
+      <w:r>
+        <w:rPr>
+          <w:rFonts w:ascii="Times New Roman" w:eastAsia="Times New Roman" w:hAnsi="Times New Roman" w:cs="Times New Roman"/>
+          <w:kern w:val="0"/>
+          <w:sz w:val="24"/>
+          <w:szCs w:val="24"/>
+          <w:highlight w:val="yellow"/>
           <w:lang w:eastAsia="fr-FR"/>
           <w14:ligatures w14:val="none"/>
         </w:rPr>
@@ -1888,16 +2808,18 @@
           <w:kern w:val="0"/>
           <w:sz w:val="24"/>
           <w:szCs w:val="24"/>
-          <w:lang w:eastAsia="fr-FR"/>
-          <w14:ligatures w14:val="none"/>
-        </w:rPr>
-      </w:pPr>
-      <w:r>
-        <w:rPr>
-          <w:rFonts w:ascii="Times New Roman" w:eastAsia="Times New Roman" w:hAnsi="Times New Roman" w:cs="Times New Roman"/>
-          <w:kern w:val="0"/>
-          <w:sz w:val="24"/>
-          <w:szCs w:val="24"/>
+          <w:highlight w:val="yellow"/>
+          <w:lang w:eastAsia="fr-FR"/>
+          <w14:ligatures w14:val="none"/>
+        </w:rPr>
+      </w:pPr>
+      <w:r>
+        <w:rPr>
+          <w:rFonts w:ascii="Times New Roman" w:eastAsia="Times New Roman" w:hAnsi="Times New Roman" w:cs="Times New Roman"/>
+          <w:kern w:val="0"/>
+          <w:sz w:val="24"/>
+          <w:szCs w:val="24"/>
+          <w:highlight w:val="yellow"/>
           <w:lang w:eastAsia="fr-FR"/>
           <w14:ligatures w14:val="none"/>
         </w:rPr>
@@ -1916,16 +2838,18 @@
           <w:kern w:val="0"/>
           <w:sz w:val="24"/>
           <w:szCs w:val="24"/>
-          <w:lang w:eastAsia="fr-FR"/>
-          <w14:ligatures w14:val="none"/>
-        </w:rPr>
-      </w:pPr>
-      <w:r>
-        <w:rPr>
-          <w:rFonts w:ascii="Times New Roman" w:eastAsia="Times New Roman" w:hAnsi="Times New Roman" w:cs="Times New Roman"/>
-          <w:kern w:val="0"/>
-          <w:sz w:val="24"/>
-          <w:szCs w:val="24"/>
+          <w:highlight w:val="yellow"/>
+          <w:lang w:eastAsia="fr-FR"/>
+          <w14:ligatures w14:val="none"/>
+        </w:rPr>
+      </w:pPr>
+      <w:r>
+        <w:rPr>
+          <w:rFonts w:ascii="Times New Roman" w:eastAsia="Times New Roman" w:hAnsi="Times New Roman" w:cs="Times New Roman"/>
+          <w:kern w:val="0"/>
+          <w:sz w:val="24"/>
+          <w:szCs w:val="24"/>
+          <w:highlight w:val="yellow"/>
           <w:lang w:eastAsia="fr-FR"/>
           <w14:ligatures w14:val="none"/>
         </w:rPr>
@@ -1987,7 +2911,7 @@
           <w:kern w:val="0"/>
           <w:sz w:val="20"/>
           <w:szCs w:val="20"/>
-          <w:lang w:eastAsia="fr-FR"/>
+          <w:lang w:val="en-US" w:eastAsia="fr-FR"/>
           <w14:ligatures w14:val="none"/>
         </w:rPr>
       </w:pPr>
@@ -1997,7 +2921,7 @@
           <w:kern w:val="0"/>
           <w:sz w:val="20"/>
           <w:szCs w:val="20"/>
-          <w:lang w:eastAsia="fr-FR"/>
+          <w:lang w:val="en-US" w:eastAsia="fr-FR"/>
           <w14:ligatures w14:val="none"/>
         </w:rPr>
         <w:t>class MLP(nn.Module):</w:t>
@@ -2029,7 +2953,7 @@
           <w:kern w:val="0"/>
           <w:sz w:val="20"/>
           <w:szCs w:val="20"/>
-          <w:lang w:eastAsia="fr-FR"/>
+          <w:lang w:val="en-US" w:eastAsia="fr-FR"/>
           <w14:ligatures w14:val="none"/>
         </w:rPr>
       </w:pPr>
@@ -2039,7 +2963,7 @@
           <w:kern w:val="0"/>
           <w:sz w:val="20"/>
           <w:szCs w:val="20"/>
-          <w:lang w:eastAsia="fr-FR"/>
+          <w:lang w:val="en-US" w:eastAsia="fr-FR"/>
           <w14:ligatures w14:val="none"/>
         </w:rPr>
         <w:t xml:space="preserve">    def __init__(self):</w:t>
@@ -2071,7 +2995,7 @@
           <w:kern w:val="0"/>
           <w:sz w:val="20"/>
           <w:szCs w:val="20"/>
-          <w:lang w:eastAsia="fr-FR"/>
+          <w:lang w:val="en-US" w:eastAsia="fr-FR"/>
           <w14:ligatures w14:val="none"/>
         </w:rPr>
       </w:pPr>
@@ -2081,7 +3005,7 @@
           <w:kern w:val="0"/>
           <w:sz w:val="20"/>
           <w:szCs w:val="20"/>
-          <w:lang w:eastAsia="fr-FR"/>
+          <w:lang w:val="en-US" w:eastAsia="fr-FR"/>
           <w14:ligatures w14:val="none"/>
         </w:rPr>
         <w:t xml:space="preserve">        super().__init__()</w:t>
@@ -2113,7 +3037,7 @@
           <w:kern w:val="0"/>
           <w:sz w:val="20"/>
           <w:szCs w:val="20"/>
-          <w:lang w:eastAsia="fr-FR"/>
+          <w:lang w:val="en-US" w:eastAsia="fr-FR"/>
           <w14:ligatures w14:val="none"/>
         </w:rPr>
       </w:pPr>
@@ -2123,7 +3047,7 @@
           <w:kern w:val="0"/>
           <w:sz w:val="20"/>
           <w:szCs w:val="20"/>
-          <w:lang w:eastAsia="fr-FR"/>
+          <w:lang w:val="en-US" w:eastAsia="fr-FR"/>
           <w14:ligatures w14:val="none"/>
         </w:rPr>
         <w:t xml:space="preserve">        self.net = nn.Sequential(</w:t>
@@ -2155,7 +3079,7 @@
           <w:kern w:val="0"/>
           <w:sz w:val="20"/>
           <w:szCs w:val="20"/>
-          <w:lang w:eastAsia="fr-FR"/>
+          <w:lang w:val="en-US" w:eastAsia="fr-FR"/>
           <w14:ligatures w14:val="none"/>
         </w:rPr>
       </w:pPr>
@@ -2165,7 +3089,7 @@
           <w:kern w:val="0"/>
           <w:sz w:val="20"/>
           <w:szCs w:val="20"/>
-          <w:lang w:eastAsia="fr-FR"/>
+          <w:lang w:val="en-US" w:eastAsia="fr-FR"/>
           <w14:ligatures w14:val="none"/>
         </w:rPr>
         <w:t xml:space="preserve">            nn.Linear(784, 128),</w:t>
@@ -2197,7 +3121,7 @@
           <w:kern w:val="0"/>
           <w:sz w:val="20"/>
           <w:szCs w:val="20"/>
-          <w:lang w:eastAsia="fr-FR"/>
+          <w:lang w:val="en-US" w:eastAsia="fr-FR"/>
           <w14:ligatures w14:val="none"/>
         </w:rPr>
       </w:pPr>
@@ -2207,7 +3131,7 @@
           <w:kern w:val="0"/>
           <w:sz w:val="20"/>
           <w:szCs w:val="20"/>
-          <w:lang w:eastAsia="fr-FR"/>
+          <w:lang w:val="en-US" w:eastAsia="fr-FR"/>
           <w14:ligatures w14:val="none"/>
         </w:rPr>
         <w:t xml:space="preserve">            nn.ReLU(),</w:t>
@@ -2239,7 +3163,7 @@
           <w:kern w:val="0"/>
           <w:sz w:val="20"/>
           <w:szCs w:val="20"/>
-          <w:lang w:eastAsia="fr-FR"/>
+          <w:lang w:val="en-US" w:eastAsia="fr-FR"/>
           <w14:ligatures w14:val="none"/>
         </w:rPr>
       </w:pPr>
@@ -2249,7 +3173,7 @@
           <w:kern w:val="0"/>
           <w:sz w:val="20"/>
           <w:szCs w:val="20"/>
-          <w:lang w:eastAsia="fr-FR"/>
+          <w:lang w:val="en-US" w:eastAsia="fr-FR"/>
           <w14:ligatures w14:val="none"/>
         </w:rPr>
         <w:t xml:space="preserve">            nn.Linear(128, 10)</w:t>
@@ -2281,7 +3205,7 @@
           <w:kern w:val="0"/>
           <w:sz w:val="20"/>
           <w:szCs w:val="20"/>
-          <w:lang w:eastAsia="fr-FR"/>
+          <w:lang w:val="en-US" w:eastAsia="fr-FR"/>
           <w14:ligatures w14:val="none"/>
         </w:rPr>
       </w:pPr>
@@ -2291,7 +3215,7 @@
           <w:kern w:val="0"/>
           <w:sz w:val="20"/>
           <w:szCs w:val="20"/>
-          <w:lang w:eastAsia="fr-FR"/>
+          <w:lang w:val="en-US" w:eastAsia="fr-FR"/>
           <w14:ligatures w14:val="none"/>
         </w:rPr>
         <w:t xml:space="preserve">        )</w:t>
@@ -2323,7 +3247,7 @@
           <w:kern w:val="0"/>
           <w:sz w:val="20"/>
           <w:szCs w:val="20"/>
-          <w:lang w:eastAsia="fr-FR"/>
+          <w:lang w:val="en-US" w:eastAsia="fr-FR"/>
           <w14:ligatures w14:val="none"/>
         </w:rPr>
       </w:pPr>
@@ -2354,7 +3278,7 @@
           <w:kern w:val="0"/>
           <w:sz w:val="20"/>
           <w:szCs w:val="20"/>
-          <w:lang w:eastAsia="fr-FR"/>
+          <w:lang w:val="en-US" w:eastAsia="fr-FR"/>
           <w14:ligatures w14:val="none"/>
         </w:rPr>
       </w:pPr>
@@ -2364,7 +3288,7 @@
           <w:kern w:val="0"/>
           <w:sz w:val="20"/>
           <w:szCs w:val="20"/>
-          <w:lang w:eastAsia="fr-FR"/>
+          <w:lang w:val="en-US" w:eastAsia="fr-FR"/>
           <w14:ligatures w14:val="none"/>
         </w:rPr>
         <w:t xml:space="preserve">    def forward(self, x):</w:t>
@@ -2396,7 +3320,7 @@
           <w:kern w:val="0"/>
           <w:sz w:val="20"/>
           <w:szCs w:val="20"/>
-          <w:lang w:eastAsia="fr-FR"/>
+          <w:lang w:val="en-US" w:eastAsia="fr-FR"/>
           <w14:ligatures w14:val="none"/>
         </w:rPr>
       </w:pPr>
@@ -2406,7 +3330,7 @@
           <w:kern w:val="0"/>
           <w:sz w:val="20"/>
           <w:szCs w:val="20"/>
-          <w:lang w:eastAsia="fr-FR"/>
+          <w:lang w:val="en-US" w:eastAsia="fr-FR"/>
           <w14:ligatures w14:val="none"/>
         </w:rPr>
         <w:t xml:space="preserve">        return self.net(x)</w:t>
@@ -2457,6 +3381,8 @@
           <w14:ligatures w14:val="none"/>
         </w:rPr>
       </w:pPr>
+      <w:proofErr w:type="spellStart"/>
+      <w:proofErr w:type="gramStart"/>
       <w:r>
         <w:rPr>
           <w:rFonts w:ascii="Courier New" w:eastAsia="Times New Roman" w:hAnsi="Courier New" w:cs="Courier New"/>
@@ -2468,6 +3394,8 @@
         </w:rPr>
         <w:t>nn.Sequential</w:t>
       </w:r>
+      <w:proofErr w:type="spellEnd"/>
+      <w:proofErr w:type="gramEnd"/>
     </w:p>
     <w:p>
       <w:pPr>
@@ -2485,6 +3413,8 @@
           <w14:ligatures w14:val="none"/>
         </w:rPr>
       </w:pPr>
+      <w:proofErr w:type="spellStart"/>
+      <w:proofErr w:type="gramStart"/>
       <w:r>
         <w:rPr>
           <w:rFonts w:ascii="Courier New" w:eastAsia="Times New Roman" w:hAnsi="Courier New" w:cs="Courier New"/>
@@ -2494,7 +3424,31 @@
           <w:lang w:eastAsia="fr-FR"/>
           <w14:ligatures w14:val="none"/>
         </w:rPr>
-        <w:t>forward()</w:t>
+        <w:t>forward</w:t>
+      </w:r>
+      <w:proofErr w:type="spellEnd"/>
+      <w:r>
+        <w:rPr>
+          <w:rFonts w:ascii="Courier New" w:eastAsia="Times New Roman" w:hAnsi="Courier New" w:cs="Courier New"/>
+          <w:kern w:val="0"/>
+          <w:sz w:val="20"/>
+          <w:szCs w:val="20"/>
+          <w:lang w:eastAsia="fr-FR"/>
+          <w14:ligatures w14:val="none"/>
+        </w:rPr>
+        <w:t>(</w:t>
+      </w:r>
+      <w:proofErr w:type="gramEnd"/>
+      <w:r>
+        <w:rPr>
+          <w:rFonts w:ascii="Courier New" w:eastAsia="Times New Roman" w:hAnsi="Courier New" w:cs="Courier New"/>
+          <w:kern w:val="0"/>
+          <w:sz w:val="20"/>
+          <w:szCs w:val="20"/>
+          <w:lang w:eastAsia="fr-FR"/>
+          <w14:ligatures w14:val="none"/>
+        </w:rPr>
+        <w:t>)</w:t>
       </w:r>
     </w:p>
     <w:p>
@@ -2522,8 +3476,21 @@
           <w:lang w:eastAsia="fr-FR"/>
           <w14:ligatures w14:val="none"/>
         </w:rPr>
-        <w:t>Shape des tensors</w:t>
-      </w:r>
+        <w:t xml:space="preserve">Shape des </w:t>
+      </w:r>
+      <w:proofErr w:type="spellStart"/>
+      <w:r>
+        <w:rPr>
+          <w:rFonts w:ascii="Times New Roman" w:eastAsia="Times New Roman" w:hAnsi="Times New Roman" w:cs="Times New Roman"/>
+          <w:kern w:val="0"/>
+          <w:sz w:val="24"/>
+          <w:szCs w:val="24"/>
+          <w:lang w:eastAsia="fr-FR"/>
+          <w14:ligatures w14:val="none"/>
+        </w:rPr>
+        <w:t>tensors</w:t>
+      </w:r>
+      <w:proofErr w:type="spellEnd"/>
     </w:p>
     <w:p>
       <w:pPr>
@@ -2753,21 +3720,51 @@
           <w:kern w:val="0"/>
           <w:sz w:val="24"/>
           <w:szCs w:val="24"/>
-          <w:lang w:eastAsia="fr-FR"/>
-          <w14:ligatures w14:val="none"/>
-        </w:rPr>
-      </w:pPr>
-      <w:r>
-        <w:rPr>
-          <w:rFonts w:ascii="Times New Roman" w:eastAsia="Times New Roman" w:hAnsi="Times New Roman" w:cs="Times New Roman"/>
-          <w:kern w:val="0"/>
-          <w:sz w:val="24"/>
-          <w:szCs w:val="24"/>
-          <w:lang w:eastAsia="fr-FR"/>
-          <w14:ligatures w14:val="none"/>
-        </w:rPr>
-        <w:t>Overfitting / Underfitting</w:t>
-      </w:r>
+          <w:highlight w:val="yellow"/>
+          <w:lang w:eastAsia="fr-FR"/>
+          <w14:ligatures w14:val="none"/>
+        </w:rPr>
+      </w:pPr>
+      <w:proofErr w:type="spellStart"/>
+      <w:r>
+        <w:rPr>
+          <w:rFonts w:ascii="Times New Roman" w:eastAsia="Times New Roman" w:hAnsi="Times New Roman" w:cs="Times New Roman"/>
+          <w:kern w:val="0"/>
+          <w:sz w:val="24"/>
+          <w:szCs w:val="24"/>
+          <w:highlight w:val="yellow"/>
+          <w:lang w:eastAsia="fr-FR"/>
+          <w14:ligatures w14:val="none"/>
+        </w:rPr>
+        <w:t>Overfitting</w:t>
+      </w:r>
+      <w:proofErr w:type="spellEnd"/>
+      <w:r>
+        <w:rPr>
+          <w:rFonts w:ascii="Times New Roman" w:eastAsia="Times New Roman" w:hAnsi="Times New Roman" w:cs="Times New Roman"/>
+          <w:kern w:val="0"/>
+          <w:sz w:val="24"/>
+          <w:szCs w:val="24"/>
+          <w:highlight w:val="yellow"/>
+          <w:lang w:eastAsia="fr-FR"/>
+          <w14:ligatures w14:val="none"/>
+        </w:rPr>
+        <w:t xml:space="preserve"> / </w:t>
+      </w:r>
+      <w:proofErr w:type="spellStart"/>
+      <w:r>
+        <w:rPr>
+          <w:rFonts w:ascii="Times New Roman" w:eastAsia="Times New Roman" w:hAnsi="Times New Roman" w:cs="Times New Roman"/>
+          <w:kern w:val="0"/>
+          <w:sz w:val="24"/>
+          <w:szCs w:val="24"/>
+          <w:highlight w:val="yellow"/>
+          <w:lang w:eastAsia="fr-FR"/>
+          <w14:ligatures w14:val="none"/>
+        </w:rPr>
+        <w:t>Underfitting</w:t>
+      </w:r>
+      <w:proofErr w:type="spellEnd"/>
     </w:p>
     <w:p>
       <w:pPr>
@@ -2781,16 +3778,18 @@
           <w:kern w:val="0"/>
           <w:sz w:val="24"/>
           <w:szCs w:val="24"/>
-          <w:lang w:eastAsia="fr-FR"/>
-          <w14:ligatures w14:val="none"/>
-        </w:rPr>
-      </w:pPr>
-      <w:r>
-        <w:rPr>
-          <w:rFonts w:ascii="Times New Roman" w:eastAsia="Times New Roman" w:hAnsi="Times New Roman" w:cs="Times New Roman"/>
-          <w:kern w:val="0"/>
-          <w:sz w:val="24"/>
-          <w:szCs w:val="24"/>
+          <w:highlight w:val="yellow"/>
+          <w:lang w:eastAsia="fr-FR"/>
+          <w14:ligatures w14:val="none"/>
+        </w:rPr>
+      </w:pPr>
+      <w:r>
+        <w:rPr>
+          <w:rFonts w:ascii="Times New Roman" w:eastAsia="Times New Roman" w:hAnsi="Times New Roman" w:cs="Times New Roman"/>
+          <w:kern w:val="0"/>
+          <w:sz w:val="24"/>
+          <w:szCs w:val="24"/>
+          <w:highlight w:val="yellow"/>
           <w:lang w:eastAsia="fr-FR"/>
           <w14:ligatures w14:val="none"/>
         </w:rPr>
@@ -2809,21 +3808,63 @@
           <w:kern w:val="0"/>
           <w:sz w:val="24"/>
           <w:szCs w:val="24"/>
-          <w:lang w:eastAsia="fr-FR"/>
-          <w14:ligatures w14:val="none"/>
-        </w:rPr>
-      </w:pPr>
-      <w:r>
-        <w:rPr>
-          <w:rFonts w:ascii="Times New Roman" w:eastAsia="Times New Roman" w:hAnsi="Times New Roman" w:cs="Times New Roman"/>
-          <w:kern w:val="0"/>
-          <w:sz w:val="24"/>
-          <w:szCs w:val="24"/>
-          <w:lang w:eastAsia="fr-FR"/>
-          <w14:ligatures w14:val="none"/>
-        </w:rPr>
-        <w:t>Batch, Epoch, Iteration</w:t>
-      </w:r>
+          <w:highlight w:val="yellow"/>
+          <w:lang w:eastAsia="fr-FR"/>
+          <w14:ligatures w14:val="none"/>
+        </w:rPr>
+      </w:pPr>
+      <w:r>
+        <w:rPr>
+          <w:rFonts w:ascii="Times New Roman" w:eastAsia="Times New Roman" w:hAnsi="Times New Roman" w:cs="Times New Roman"/>
+          <w:kern w:val="0"/>
+          <w:sz w:val="24"/>
+          <w:szCs w:val="24"/>
+          <w:highlight w:val="yellow"/>
+          <w:lang w:eastAsia="fr-FR"/>
+          <w14:ligatures w14:val="none"/>
+        </w:rPr>
+        <w:t xml:space="preserve">Batch, </w:t>
+      </w:r>
+      <w:proofErr w:type="spellStart"/>
+      <w:r>
+        <w:rPr>
+          <w:rFonts w:ascii="Times New Roman" w:eastAsia="Times New Roman" w:hAnsi="Times New Roman" w:cs="Times New Roman"/>
+          <w:kern w:val="0"/>
+          <w:sz w:val="24"/>
+          <w:szCs w:val="24"/>
+          <w:highlight w:val="yellow"/>
+          <w:lang w:eastAsia="fr-FR"/>
+          <w14:ligatures w14:val="none"/>
+        </w:rPr>
+        <w:t>Epoch</w:t>
+      </w:r>
+      <w:proofErr w:type="spellEnd"/>
+      <w:r>
+        <w:rPr>
+          <w:rFonts w:ascii="Times New Roman" w:eastAsia="Times New Roman" w:hAnsi="Times New Roman" w:cs="Times New Roman"/>
+          <w:kern w:val="0"/>
+          <w:sz w:val="24"/>
+          <w:szCs w:val="24"/>
+          <w:highlight w:val="yellow"/>
+          <w:lang w:eastAsia="fr-FR"/>
+          <w14:ligatures w14:val="none"/>
+        </w:rPr>
+        <w:t xml:space="preserve">, </w:t>
+      </w:r>
+      <w:proofErr w:type="spellStart"/>
+      <w:r>
+        <w:rPr>
+          <w:rFonts w:ascii="Times New Roman" w:eastAsia="Times New Roman" w:hAnsi="Times New Roman" w:cs="Times New Roman"/>
+          <w:kern w:val="0"/>
+          <w:sz w:val="24"/>
+          <w:szCs w:val="24"/>
+          <w:highlight w:val="yellow"/>
+          <w:lang w:eastAsia="fr-FR"/>
+          <w14:ligatures w14:val="none"/>
+        </w:rPr>
+        <w:t>Iteration</w:t>
+      </w:r>
+      <w:proofErr w:type="spellEnd"/>
     </w:p>
     <w:p>
       <w:pPr>
@@ -2870,6 +3911,7 @@
           <w14:ligatures w14:val="none"/>
         </w:rPr>
       </w:pPr>
+      <w:proofErr w:type="spellStart"/>
       <w:r>
         <w:rPr>
           <w:rFonts w:ascii="Courier New" w:eastAsia="Times New Roman" w:hAnsi="Courier New" w:cs="Courier New"/>
@@ -2881,6 +3923,7 @@
         </w:rPr>
         <w:t>DataLoader</w:t>
       </w:r>
+      <w:proofErr w:type="spellEnd"/>
     </w:p>
     <w:p>
       <w:pPr>
@@ -2898,6 +3941,7 @@
           <w14:ligatures w14:val="none"/>
         </w:rPr>
       </w:pPr>
+      <w:proofErr w:type="spellStart"/>
       <w:r>
         <w:rPr>
           <w:rFonts w:ascii="Courier New" w:eastAsia="Times New Roman" w:hAnsi="Courier New" w:cs="Courier New"/>
@@ -2909,6 +3953,7 @@
         </w:rPr>
         <w:t>Dataset</w:t>
       </w:r>
+      <w:proofErr w:type="spellEnd"/>
     </w:p>
     <w:p>
       <w:pPr>
@@ -2949,8 +3994,58 @@
           <w:lang w:val="en-US" w:eastAsia="fr-FR"/>
           <w14:ligatures w14:val="none"/>
         </w:rPr>
-        <w:t>from torch.utils.data import DataLoader</w:t>
-      </w:r>
+        <w:t xml:space="preserve">from </w:t>
+      </w:r>
+      <w:proofErr w:type="spellStart"/>
+      <w:proofErr w:type="gramStart"/>
+      <w:r>
+        <w:rPr>
+          <w:rFonts w:ascii="Courier New" w:eastAsia="Times New Roman" w:hAnsi="Courier New" w:cs="Courier New"/>
+          <w:kern w:val="0"/>
+          <w:sz w:val="20"/>
+          <w:szCs w:val="20"/>
+          <w:lang w:val="en-US" w:eastAsia="fr-FR"/>
+          <w14:ligatures w14:val="none"/>
+        </w:rPr>
+        <w:t>torch.utils</w:t>
+      </w:r>
+      <w:proofErr w:type="gramEnd"/>
+      <w:r>
+        <w:rPr>
+          <w:rFonts w:ascii="Courier New" w:eastAsia="Times New Roman" w:hAnsi="Courier New" w:cs="Courier New"/>
+          <w:kern w:val="0"/>
+          <w:sz w:val="20"/>
+          <w:szCs w:val="20"/>
+          <w:lang w:val="en-US" w:eastAsia="fr-FR"/>
+          <w14:ligatures w14:val="none"/>
+        </w:rPr>
+        <w:t>.data</w:t>
+      </w:r>
+      <w:proofErr w:type="spellEnd"/>
+      <w:r>
+        <w:rPr>
+          <w:rFonts w:ascii="Courier New" w:eastAsia="Times New Roman" w:hAnsi="Courier New" w:cs="Courier New"/>
+          <w:kern w:val="0"/>
+          <w:sz w:val="20"/>
+          <w:szCs w:val="20"/>
+          <w:lang w:val="en-US" w:eastAsia="fr-FR"/>
+          <w14:ligatures w14:val="none"/>
+        </w:rPr>
+        <w:t xml:space="preserve"> import </w:t>
+      </w:r>
+      <w:proofErr w:type="spellStart"/>
+      <w:r>
+        <w:rPr>
+          <w:rFonts w:ascii="Courier New" w:eastAsia="Times New Roman" w:hAnsi="Courier New" w:cs="Courier New"/>
+          <w:kern w:val="0"/>
+          <w:sz w:val="20"/>
+          <w:szCs w:val="20"/>
+          <w:lang w:val="en-US" w:eastAsia="fr-FR"/>
+          <w14:ligatures w14:val="none"/>
+        </w:rPr>
+        <w:t>DataLoader</w:t>
+      </w:r>
+      <w:proofErr w:type="spellEnd"/>
     </w:p>
     <w:p>
       <w:pPr>
@@ -3044,16 +4139,29 @@
           <w14:ligatures w14:val="none"/>
         </w:rPr>
       </w:pPr>
-      <w:r>
-        <w:rPr>
-          <w:rFonts w:ascii="Times New Roman" w:eastAsia="Times New Roman" w:hAnsi="Times New Roman" w:cs="Times New Roman"/>
-          <w:kern w:val="0"/>
-          <w:sz w:val="24"/>
-          <w:szCs w:val="24"/>
-          <w:lang w:eastAsia="fr-FR"/>
-          <w14:ligatures w14:val="none"/>
-        </w:rPr>
-        <w:t>Shuffle on/off</w:t>
+      <w:proofErr w:type="spellStart"/>
+      <w:r>
+        <w:rPr>
+          <w:rFonts w:ascii="Times New Roman" w:eastAsia="Times New Roman" w:hAnsi="Times New Roman" w:cs="Times New Roman"/>
+          <w:kern w:val="0"/>
+          <w:sz w:val="24"/>
+          <w:szCs w:val="24"/>
+          <w:lang w:eastAsia="fr-FR"/>
+          <w14:ligatures w14:val="none"/>
+        </w:rPr>
+        <w:t>Shuffle</w:t>
+      </w:r>
+      <w:proofErr w:type="spellEnd"/>
+      <w:r>
+        <w:rPr>
+          <w:rFonts w:ascii="Times New Roman" w:eastAsia="Times New Roman" w:hAnsi="Times New Roman" w:cs="Times New Roman"/>
+          <w:kern w:val="0"/>
+          <w:sz w:val="24"/>
+          <w:szCs w:val="24"/>
+          <w:lang w:eastAsia="fr-FR"/>
+          <w14:ligatures w14:val="none"/>
+        </w:rPr>
+        <w:t xml:space="preserve"> on/off</w:t>
       </w:r>
     </w:p>
     <w:p>
@@ -3081,8 +4189,21 @@
           <w:lang w:eastAsia="fr-FR"/>
           <w14:ligatures w14:val="none"/>
         </w:rPr>
-        <w:t>Early stopping</w:t>
-      </w:r>
+        <w:t xml:space="preserve">Early </w:t>
+      </w:r>
+      <w:proofErr w:type="spellStart"/>
+      <w:r>
+        <w:rPr>
+          <w:rFonts w:ascii="Times New Roman" w:eastAsia="Times New Roman" w:hAnsi="Times New Roman" w:cs="Times New Roman"/>
+          <w:kern w:val="0"/>
+          <w:sz w:val="24"/>
+          <w:szCs w:val="24"/>
+          <w:lang w:eastAsia="fr-FR"/>
+          <w14:ligatures w14:val="none"/>
+        </w:rPr>
+        <w:t>stopping</w:t>
+      </w:r>
+      <w:proofErr w:type="spellEnd"/>
     </w:p>
     <w:p>
       <w:pPr>
@@ -3184,17 +4305,43 @@
           <w14:ligatures w14:val="none"/>
         </w:rPr>
       </w:pPr>
-      <w:r>
-        <w:rPr>
-          <w:rFonts w:ascii="Times New Roman" w:eastAsia="Times New Roman" w:hAnsi="Times New Roman" w:cs="Times New Roman"/>
-          <w:kern w:val="0"/>
-          <w:sz w:val="24"/>
-          <w:szCs w:val="24"/>
-          <w:lang w:eastAsia="fr-FR"/>
-          <w14:ligatures w14:val="none"/>
-        </w:rPr>
-        <w:t>Optimizers : SGD, Adam, RMSprop</w:t>
-      </w:r>
+      <w:proofErr w:type="spellStart"/>
+      <w:r>
+        <w:rPr>
+          <w:rFonts w:ascii="Times New Roman" w:eastAsia="Times New Roman" w:hAnsi="Times New Roman" w:cs="Times New Roman"/>
+          <w:kern w:val="0"/>
+          <w:sz w:val="24"/>
+          <w:szCs w:val="24"/>
+          <w:lang w:eastAsia="fr-FR"/>
+          <w14:ligatures w14:val="none"/>
+        </w:rPr>
+        <w:t>Optimizers</w:t>
+      </w:r>
+      <w:proofErr w:type="spellEnd"/>
+      <w:r>
+        <w:rPr>
+          <w:rFonts w:ascii="Times New Roman" w:eastAsia="Times New Roman" w:hAnsi="Times New Roman" w:cs="Times New Roman"/>
+          <w:kern w:val="0"/>
+          <w:sz w:val="24"/>
+          <w:szCs w:val="24"/>
+          <w:lang w:eastAsia="fr-FR"/>
+          <w14:ligatures w14:val="none"/>
+        </w:rPr>
+        <w:t xml:space="preserve"> : SGD, Adam, </w:t>
+      </w:r>
+      <w:proofErr w:type="spellStart"/>
+      <w:r>
+        <w:rPr>
+          <w:rFonts w:ascii="Times New Roman" w:eastAsia="Times New Roman" w:hAnsi="Times New Roman" w:cs="Times New Roman"/>
+          <w:kern w:val="0"/>
+          <w:sz w:val="24"/>
+          <w:szCs w:val="24"/>
+          <w:lang w:eastAsia="fr-FR"/>
+          <w14:ligatures w14:val="none"/>
+        </w:rPr>
+        <w:t>RMSprop</w:t>
+      </w:r>
+      <w:proofErr w:type="spellEnd"/>
     </w:p>
     <w:p>
       <w:pPr>
@@ -3212,16 +4359,29 @@
           <w14:ligatures w14:val="none"/>
         </w:rPr>
       </w:pPr>
-      <w:r>
-        <w:rPr>
-          <w:rFonts w:ascii="Times New Roman" w:eastAsia="Times New Roman" w:hAnsi="Times New Roman" w:cs="Times New Roman"/>
-          <w:kern w:val="0"/>
-          <w:sz w:val="24"/>
-          <w:szCs w:val="24"/>
-          <w:lang w:eastAsia="fr-FR"/>
-          <w14:ligatures w14:val="none"/>
-        </w:rPr>
-        <w:t>Regularization :</w:t>
+      <w:proofErr w:type="spellStart"/>
+      <w:r>
+        <w:rPr>
+          <w:rFonts w:ascii="Times New Roman" w:eastAsia="Times New Roman" w:hAnsi="Times New Roman" w:cs="Times New Roman"/>
+          <w:kern w:val="0"/>
+          <w:sz w:val="24"/>
+          <w:szCs w:val="24"/>
+          <w:lang w:eastAsia="fr-FR"/>
+          <w14:ligatures w14:val="none"/>
+        </w:rPr>
+        <w:t>Regularization</w:t>
+      </w:r>
+      <w:proofErr w:type="spellEnd"/>
+      <w:r>
+        <w:rPr>
+          <w:rFonts w:ascii="Times New Roman" w:eastAsia="Times New Roman" w:hAnsi="Times New Roman" w:cs="Times New Roman"/>
+          <w:kern w:val="0"/>
+          <w:sz w:val="24"/>
+          <w:szCs w:val="24"/>
+          <w:lang w:eastAsia="fr-FR"/>
+          <w14:ligatures w14:val="none"/>
+        </w:rPr>
+        <w:t xml:space="preserve"> :</w:t>
       </w:r>
     </w:p>
     <w:p>
@@ -3305,8 +4465,21 @@
           <w:lang w:eastAsia="fr-FR"/>
           <w14:ligatures w14:val="none"/>
         </w:rPr>
-        <w:t>Learning rate scheduling</w:t>
-      </w:r>
+        <w:t xml:space="preserve">Learning rate </w:t>
+      </w:r>
+      <w:proofErr w:type="spellStart"/>
+      <w:r>
+        <w:rPr>
+          <w:rFonts w:ascii="Times New Roman" w:eastAsia="Times New Roman" w:hAnsi="Times New Roman" w:cs="Times New Roman"/>
+          <w:kern w:val="0"/>
+          <w:sz w:val="24"/>
+          <w:szCs w:val="24"/>
+          <w:lang w:eastAsia="fr-FR"/>
+          <w14:ligatures w14:val="none"/>
+        </w:rPr>
+        <w:t>scheduling</w:t>
+      </w:r>
+      <w:proofErr w:type="spellEnd"/>
     </w:p>
     <w:p>
       <w:pPr>
@@ -3367,6 +4540,8 @@
           <w14:ligatures w14:val="none"/>
         </w:rPr>
       </w:pPr>
+      <w:proofErr w:type="spellStart"/>
+      <w:proofErr w:type="gramStart"/>
       <w:r>
         <w:rPr>
           <w:rFonts w:ascii="Courier New" w:eastAsia="Times New Roman" w:hAnsi="Courier New" w:cs="Courier New"/>
@@ -3376,7 +4551,20 @@
           <w:lang w:eastAsia="fr-FR"/>
           <w14:ligatures w14:val="none"/>
         </w:rPr>
-        <w:t>nn.Dropout(0.5)</w:t>
+        <w:t>nn.Dropout</w:t>
+      </w:r>
+      <w:proofErr w:type="spellEnd"/>
+      <w:proofErr w:type="gramEnd"/>
+      <w:r>
+        <w:rPr>
+          <w:rFonts w:ascii="Courier New" w:eastAsia="Times New Roman" w:hAnsi="Courier New" w:cs="Courier New"/>
+          <w:kern w:val="0"/>
+          <w:sz w:val="20"/>
+          <w:szCs w:val="20"/>
+          <w:lang w:eastAsia="fr-FR"/>
+          <w14:ligatures w14:val="none"/>
+        </w:rPr>
+        <w:t>(0.5)</w:t>
       </w:r>
     </w:p>
     <w:p>
@@ -3409,6 +4597,8 @@
           <w14:ligatures w14:val="none"/>
         </w:rPr>
       </w:pPr>
+      <w:proofErr w:type="spellStart"/>
+      <w:proofErr w:type="gramStart"/>
       <w:r>
         <w:rPr>
           <w:rFonts w:ascii="Courier New" w:eastAsia="Times New Roman" w:hAnsi="Courier New" w:cs="Courier New"/>
@@ -3418,7 +4608,81 @@
           <w:lang w:val="en-US" w:eastAsia="fr-FR"/>
           <w14:ligatures w14:val="none"/>
         </w:rPr>
-        <w:t>torch.optim.Adam(model.parameters(), lr=0.001)</w:t>
+        <w:t>torch.optim</w:t>
+      </w:r>
+      <w:proofErr w:type="gramEnd"/>
+      <w:r>
+        <w:rPr>
+          <w:rFonts w:ascii="Courier New" w:eastAsia="Times New Roman" w:hAnsi="Courier New" w:cs="Courier New"/>
+          <w:kern w:val="0"/>
+          <w:sz w:val="20"/>
+          <w:szCs w:val="20"/>
+          <w:lang w:val="en-US" w:eastAsia="fr-FR"/>
+          <w14:ligatures w14:val="none"/>
+        </w:rPr>
+        <w:t>.Adam</w:t>
+      </w:r>
+      <w:proofErr w:type="spellEnd"/>
+      <w:r>
+        <w:rPr>
+          <w:rFonts w:ascii="Courier New" w:eastAsia="Times New Roman" w:hAnsi="Courier New" w:cs="Courier New"/>
+          <w:kern w:val="0"/>
+          <w:sz w:val="20"/>
+          <w:szCs w:val="20"/>
+          <w:lang w:val="en-US" w:eastAsia="fr-FR"/>
+          <w14:ligatures w14:val="none"/>
+        </w:rPr>
+        <w:t>(</w:t>
+      </w:r>
+      <w:proofErr w:type="spellStart"/>
+      <w:proofErr w:type="gramStart"/>
+      <w:r>
+        <w:rPr>
+          <w:rFonts w:ascii="Courier New" w:eastAsia="Times New Roman" w:hAnsi="Courier New" w:cs="Courier New"/>
+          <w:kern w:val="0"/>
+          <w:sz w:val="20"/>
+          <w:szCs w:val="20"/>
+          <w:lang w:val="en-US" w:eastAsia="fr-FR"/>
+          <w14:ligatures w14:val="none"/>
+        </w:rPr>
+        <w:t>model.parameters</w:t>
+      </w:r>
+      <w:proofErr w:type="spellEnd"/>
+      <w:proofErr w:type="gramEnd"/>
+      <w:r>
+        <w:rPr>
+          <w:rFonts w:ascii="Courier New" w:eastAsia="Times New Roman" w:hAnsi="Courier New" w:cs="Courier New"/>
+          <w:kern w:val="0"/>
+          <w:sz w:val="20"/>
+          <w:szCs w:val="20"/>
+          <w:lang w:val="en-US" w:eastAsia="fr-FR"/>
+          <w14:ligatures w14:val="none"/>
+        </w:rPr>
+        <w:t xml:space="preserve">(), </w:t>
+      </w:r>
+      <w:proofErr w:type="spellStart"/>
+      <w:r>
+        <w:rPr>
+          <w:rFonts w:ascii="Courier New" w:eastAsia="Times New Roman" w:hAnsi="Courier New" w:cs="Courier New"/>
+          <w:kern w:val="0"/>
+          <w:sz w:val="20"/>
+          <w:szCs w:val="20"/>
+          <w:lang w:val="en-US" w:eastAsia="fr-FR"/>
+          <w14:ligatures w14:val="none"/>
+        </w:rPr>
+        <w:t>lr</w:t>
+      </w:r>
+      <w:proofErr w:type="spellEnd"/>
+      <w:r>
+        <w:rPr>
+          <w:rFonts w:ascii="Courier New" w:eastAsia="Times New Roman" w:hAnsi="Courier New" w:cs="Courier New"/>
+          <w:kern w:val="0"/>
+          <w:sz w:val="20"/>
+          <w:szCs w:val="20"/>
+          <w:lang w:val="en-US" w:eastAsia="fr-FR"/>
+          <w14:ligatures w14:val="none"/>
+        </w:rPr>
+        <w:t>=0.001)</w:t>
       </w:r>
     </w:p>
     <w:p>
@@ -3522,8 +4786,45 @@
           <w:lang w:eastAsia="fr-FR"/>
           <w14:ligatures w14:val="none"/>
         </w:rPr>
-        <w:t>Implémenter weight decay</w:t>
-      </w:r>
+        <w:t xml:space="preserve">Implémenter </w:t>
+      </w:r>
+      <w:proofErr w:type="spellStart"/>
+      <w:r>
+        <w:rPr>
+          <w:rFonts w:ascii="Times New Roman" w:eastAsia="Times New Roman" w:hAnsi="Times New Roman" w:cs="Times New Roman"/>
+          <w:kern w:val="0"/>
+          <w:sz w:val="24"/>
+          <w:szCs w:val="24"/>
+          <w:lang w:eastAsia="fr-FR"/>
+          <w14:ligatures w14:val="none"/>
+        </w:rPr>
+        <w:t>weight</w:t>
+      </w:r>
+      <w:proofErr w:type="spellEnd"/>
+      <w:r>
+        <w:rPr>
+          <w:rFonts w:ascii="Times New Roman" w:eastAsia="Times New Roman" w:hAnsi="Times New Roman" w:cs="Times New Roman"/>
+          <w:kern w:val="0"/>
+          <w:sz w:val="24"/>
+          <w:szCs w:val="24"/>
+          <w:lang w:eastAsia="fr-FR"/>
+          <w14:ligatures w14:val="none"/>
+        </w:rPr>
+        <w:t xml:space="preserve"> </w:t>
+      </w:r>
+      <w:proofErr w:type="spellStart"/>
+      <w:r>
+        <w:rPr>
+          <w:rFonts w:ascii="Times New Roman" w:eastAsia="Times New Roman" w:hAnsi="Times New Roman" w:cs="Times New Roman"/>
+          <w:kern w:val="0"/>
+          <w:sz w:val="24"/>
+          <w:szCs w:val="24"/>
+          <w:lang w:eastAsia="fr-FR"/>
+          <w14:ligatures w14:val="none"/>
+        </w:rPr>
+        <w:t>decay</w:t>
+      </w:r>
+      <w:proofErr w:type="spellEnd"/>
     </w:p>
     <w:p>
       <w:pPr>
@@ -3541,17 +4842,31 @@
           <w14:ligatures w14:val="none"/>
         </w:rPr>
       </w:pPr>
-      <w:r>
-        <w:rPr>
-          <w:rFonts w:ascii="Times New Roman" w:eastAsia="Times New Roman" w:hAnsi="Times New Roman" w:cs="Times New Roman"/>
-          <w:kern w:val="0"/>
-          <w:sz w:val="24"/>
-          <w:szCs w:val="24"/>
-          <w:lang w:eastAsia="fr-FR"/>
-          <w14:ligatures w14:val="none"/>
-        </w:rPr>
-        <w:t xml:space="preserve">Scheduler </w:t>
-      </w:r>
+      <w:proofErr w:type="spellStart"/>
+      <w:r>
+        <w:rPr>
+          <w:rFonts w:ascii="Times New Roman" w:eastAsia="Times New Roman" w:hAnsi="Times New Roman" w:cs="Times New Roman"/>
+          <w:kern w:val="0"/>
+          <w:sz w:val="24"/>
+          <w:szCs w:val="24"/>
+          <w:lang w:eastAsia="fr-FR"/>
+          <w14:ligatures w14:val="none"/>
+        </w:rPr>
+        <w:t>Scheduler</w:t>
+      </w:r>
+      <w:proofErr w:type="spellEnd"/>
+      <w:r>
+        <w:rPr>
+          <w:rFonts w:ascii="Times New Roman" w:eastAsia="Times New Roman" w:hAnsi="Times New Roman" w:cs="Times New Roman"/>
+          <w:kern w:val="0"/>
+          <w:sz w:val="24"/>
+          <w:szCs w:val="24"/>
+          <w:lang w:eastAsia="fr-FR"/>
+          <w14:ligatures w14:val="none"/>
+        </w:rPr>
+        <w:t xml:space="preserve"> </w:t>
+      </w:r>
+      <w:proofErr w:type="spellStart"/>
       <w:r>
         <w:rPr>
           <w:rFonts w:ascii="Courier New" w:eastAsia="Times New Roman" w:hAnsi="Courier New" w:cs="Courier New"/>
@@ -3563,6 +4878,7 @@
         </w:rPr>
         <w:t>StepLR</w:t>
       </w:r>
+      <w:proofErr w:type="spellEnd"/>
     </w:p>
     <w:p>
       <w:pPr>
@@ -3616,7 +4932,35 @@
           <w:lang w:eastAsia="fr-FR"/>
           <w14:ligatures w14:val="none"/>
         </w:rPr>
-        <w:t>8. Réseaux de neurones convolutionnels (CNN)</w:t>
+        <w:t xml:space="preserve">8. Réseaux de neurones </w:t>
+      </w:r>
+      <w:proofErr w:type="spellStart"/>
+      <w:r>
+        <w:rPr>
+          <w:rFonts w:ascii="Times New Roman" w:eastAsia="Times New Roman" w:hAnsi="Times New Roman" w:cs="Times New Roman"/>
+          <w:b/>
+          <w:bCs/>
+          <w:kern w:val="0"/>
+          <w:sz w:val="36"/>
+          <w:szCs w:val="36"/>
+          <w:lang w:eastAsia="fr-FR"/>
+          <w14:ligatures w14:val="none"/>
+        </w:rPr>
+        <w:t>convolutionnels</w:t>
+      </w:r>
+      <w:proofErr w:type="spellEnd"/>
+      <w:r>
+        <w:rPr>
+          <w:rFonts w:ascii="Times New Roman" w:eastAsia="Times New Roman" w:hAnsi="Times New Roman" w:cs="Times New Roman"/>
+          <w:b/>
+          <w:bCs/>
+          <w:kern w:val="0"/>
+          <w:sz w:val="36"/>
+          <w:szCs w:val="36"/>
+          <w:lang w:eastAsia="fr-FR"/>
+          <w14:ligatures w14:val="none"/>
+        </w:rPr>
+        <w:t xml:space="preserve"> (CNN)</w:t>
       </w:r>
     </w:p>
     <w:p>
@@ -3720,6 +5064,7 @@
           <w14:ligatures w14:val="none"/>
         </w:rPr>
       </w:pPr>
+      <w:proofErr w:type="spellStart"/>
       <w:r>
         <w:rPr>
           <w:rFonts w:ascii="Times New Roman" w:eastAsia="Times New Roman" w:hAnsi="Times New Roman" w:cs="Times New Roman"/>
@@ -3731,6 +5076,7 @@
         </w:rPr>
         <w:t>Pooling</w:t>
       </w:r>
+      <w:proofErr w:type="spellEnd"/>
     </w:p>
     <w:p>
       <w:pPr>
@@ -3748,17 +5094,43 @@
           <w14:ligatures w14:val="none"/>
         </w:rPr>
       </w:pPr>
-      <w:r>
-        <w:rPr>
-          <w:rFonts w:ascii="Times New Roman" w:eastAsia="Times New Roman" w:hAnsi="Times New Roman" w:cs="Times New Roman"/>
-          <w:kern w:val="0"/>
-          <w:sz w:val="24"/>
-          <w:szCs w:val="24"/>
-          <w:lang w:eastAsia="fr-FR"/>
-          <w14:ligatures w14:val="none"/>
-        </w:rPr>
-        <w:t>Feature maps</w:t>
-      </w:r>
+      <w:proofErr w:type="spellStart"/>
+      <w:r>
+        <w:rPr>
+          <w:rFonts w:ascii="Times New Roman" w:eastAsia="Times New Roman" w:hAnsi="Times New Roman" w:cs="Times New Roman"/>
+          <w:kern w:val="0"/>
+          <w:sz w:val="24"/>
+          <w:szCs w:val="24"/>
+          <w:lang w:eastAsia="fr-FR"/>
+          <w14:ligatures w14:val="none"/>
+        </w:rPr>
+        <w:t>Feature</w:t>
+      </w:r>
+      <w:proofErr w:type="spellEnd"/>
+      <w:r>
+        <w:rPr>
+          <w:rFonts w:ascii="Times New Roman" w:eastAsia="Times New Roman" w:hAnsi="Times New Roman" w:cs="Times New Roman"/>
+          <w:kern w:val="0"/>
+          <w:sz w:val="24"/>
+          <w:szCs w:val="24"/>
+          <w:lang w:eastAsia="fr-FR"/>
+          <w14:ligatures w14:val="none"/>
+        </w:rPr>
+        <w:t xml:space="preserve"> </w:t>
+      </w:r>
+      <w:proofErr w:type="spellStart"/>
+      <w:r>
+        <w:rPr>
+          <w:rFonts w:ascii="Times New Roman" w:eastAsia="Times New Roman" w:hAnsi="Times New Roman" w:cs="Times New Roman"/>
+          <w:kern w:val="0"/>
+          <w:sz w:val="24"/>
+          <w:szCs w:val="24"/>
+          <w:lang w:eastAsia="fr-FR"/>
+          <w14:ligatures w14:val="none"/>
+        </w:rPr>
+        <w:t>maps</w:t>
+      </w:r>
+      <w:proofErr w:type="spellEnd"/>
     </w:p>
     <w:p>
       <w:pPr>
@@ -3819,6 +5191,7 @@
           <w14:ligatures w14:val="none"/>
         </w:rPr>
       </w:pPr>
+      <w:proofErr w:type="gramStart"/>
       <w:r>
         <w:rPr>
           <w:rFonts w:ascii="Courier New" w:eastAsia="Times New Roman" w:hAnsi="Courier New" w:cs="Courier New"/>
@@ -3828,7 +5201,67 @@
           <w:lang w:eastAsia="fr-FR"/>
           <w14:ligatures w14:val="none"/>
         </w:rPr>
-        <w:t>nn.Conv2d(1, 32, kernel_size=3)</w:t>
+        <w:t>nn.Conv</w:t>
+      </w:r>
+      <w:proofErr w:type="gramEnd"/>
+      <w:r>
+        <w:rPr>
+          <w:rFonts w:ascii="Courier New" w:eastAsia="Times New Roman" w:hAnsi="Courier New" w:cs="Courier New"/>
+          <w:kern w:val="0"/>
+          <w:sz w:val="20"/>
+          <w:szCs w:val="20"/>
+          <w:lang w:eastAsia="fr-FR"/>
+          <w14:ligatures w14:val="none"/>
+        </w:rPr>
+        <w:t>2</w:t>
+      </w:r>
+      <w:proofErr w:type="gramStart"/>
+      <w:r>
+        <w:rPr>
+          <w:rFonts w:ascii="Courier New" w:eastAsia="Times New Roman" w:hAnsi="Courier New" w:cs="Courier New"/>
+          <w:kern w:val="0"/>
+          <w:sz w:val="20"/>
+          <w:szCs w:val="20"/>
+          <w:lang w:eastAsia="fr-FR"/>
+          <w14:ligatures w14:val="none"/>
+        </w:rPr>
+        <w:t>d(</w:t>
+      </w:r>
+      <w:proofErr w:type="gramEnd"/>
+      <w:r>
+        <w:rPr>
+          <w:rFonts w:ascii="Courier New" w:eastAsia="Times New Roman" w:hAnsi="Courier New" w:cs="Courier New"/>
+          <w:kern w:val="0"/>
+          <w:sz w:val="20"/>
+          <w:szCs w:val="20"/>
+          <w:lang w:eastAsia="fr-FR"/>
+          <w14:ligatures w14:val="none"/>
+        </w:rPr>
+        <w:t xml:space="preserve">1, 32, </w:t>
+      </w:r>
+      <w:proofErr w:type="spellStart"/>
+      <w:r>
+        <w:rPr>
+          <w:rFonts w:ascii="Courier New" w:eastAsia="Times New Roman" w:hAnsi="Courier New" w:cs="Courier New"/>
+          <w:kern w:val="0"/>
+          <w:sz w:val="20"/>
+          <w:szCs w:val="20"/>
+          <w:lang w:eastAsia="fr-FR"/>
+          <w14:ligatures w14:val="none"/>
+        </w:rPr>
+        <w:t>kernel_size</w:t>
+      </w:r>
+      <w:proofErr w:type="spellEnd"/>
+      <w:r>
+        <w:rPr>
+          <w:rFonts w:ascii="Courier New" w:eastAsia="Times New Roman" w:hAnsi="Courier New" w:cs="Courier New"/>
+          <w:kern w:val="0"/>
+          <w:sz w:val="20"/>
+          <w:szCs w:val="20"/>
+          <w:lang w:eastAsia="fr-FR"/>
+          <w14:ligatures w14:val="none"/>
+        </w:rPr>
+        <w:t>=3)</w:t>
       </w:r>
     </w:p>
     <w:p>
@@ -3861,6 +5294,7 @@
           <w14:ligatures w14:val="none"/>
         </w:rPr>
       </w:pPr>
+      <w:proofErr w:type="gramStart"/>
       <w:r>
         <w:rPr>
           <w:rFonts w:ascii="Courier New" w:eastAsia="Times New Roman" w:hAnsi="Courier New" w:cs="Courier New"/>
@@ -3870,7 +5304,43 @@
           <w:lang w:eastAsia="fr-FR"/>
           <w14:ligatures w14:val="none"/>
         </w:rPr>
-        <w:t>nn.MaxPool2d(2)</w:t>
+        <w:t>nn.MaxPool</w:t>
+      </w:r>
+      <w:proofErr w:type="gramEnd"/>
+      <w:r>
+        <w:rPr>
+          <w:rFonts w:ascii="Courier New" w:eastAsia="Times New Roman" w:hAnsi="Courier New" w:cs="Courier New"/>
+          <w:kern w:val="0"/>
+          <w:sz w:val="20"/>
+          <w:szCs w:val="20"/>
+          <w:lang w:eastAsia="fr-FR"/>
+          <w14:ligatures w14:val="none"/>
+        </w:rPr>
+        <w:t>2</w:t>
+      </w:r>
+      <w:proofErr w:type="gramStart"/>
+      <w:r>
+        <w:rPr>
+          <w:rFonts w:ascii="Courier New" w:eastAsia="Times New Roman" w:hAnsi="Courier New" w:cs="Courier New"/>
+          <w:kern w:val="0"/>
+          <w:sz w:val="20"/>
+          <w:szCs w:val="20"/>
+          <w:lang w:eastAsia="fr-FR"/>
+          <w14:ligatures w14:val="none"/>
+        </w:rPr>
+        <w:t>d(</w:t>
+      </w:r>
+      <w:proofErr w:type="gramEnd"/>
+      <w:r>
+        <w:rPr>
+          <w:rFonts w:ascii="Courier New" w:eastAsia="Times New Roman" w:hAnsi="Courier New" w:cs="Courier New"/>
+          <w:kern w:val="0"/>
+          <w:sz w:val="20"/>
+          <w:szCs w:val="20"/>
+          <w:lang w:eastAsia="fr-FR"/>
+          <w14:ligatures w14:val="none"/>
+        </w:rPr>
+        <w:t>2)</w:t>
       </w:r>
     </w:p>
     <w:p>
@@ -4029,7 +5499,35 @@
           <w:lang w:eastAsia="fr-FR"/>
           <w14:ligatures w14:val="none"/>
         </w:rPr>
-        <w:t>9. Debugging &amp; bonnes pratiques</w:t>
+        <w:t xml:space="preserve">9. </w:t>
+      </w:r>
+      <w:proofErr w:type="spellStart"/>
+      <w:r>
+        <w:rPr>
+          <w:rFonts w:ascii="Times New Roman" w:eastAsia="Times New Roman" w:hAnsi="Times New Roman" w:cs="Times New Roman"/>
+          <w:b/>
+          <w:bCs/>
+          <w:kern w:val="0"/>
+          <w:sz w:val="36"/>
+          <w:szCs w:val="36"/>
+          <w:lang w:eastAsia="fr-FR"/>
+          <w14:ligatures w14:val="none"/>
+        </w:rPr>
+        <w:t>Debugging</w:t>
+      </w:r>
+      <w:proofErr w:type="spellEnd"/>
+      <w:r>
+        <w:rPr>
+          <w:rFonts w:ascii="Times New Roman" w:eastAsia="Times New Roman" w:hAnsi="Times New Roman" w:cs="Times New Roman"/>
+          <w:b/>
+          <w:bCs/>
+          <w:kern w:val="0"/>
+          <w:sz w:val="36"/>
+          <w:szCs w:val="36"/>
+          <w:lang w:eastAsia="fr-FR"/>
+          <w14:ligatures w14:val="none"/>
+        </w:rPr>
+        <w:t xml:space="preserve"> &amp; bonnes pratiques</w:t>
       </w:r>
     </w:p>
     <w:p>
@@ -4077,16 +5575,53 @@
           <w14:ligatures w14:val="none"/>
         </w:rPr>
       </w:pPr>
-      <w:r>
-        <w:rPr>
-          <w:rFonts w:ascii="Times New Roman" w:eastAsia="Times New Roman" w:hAnsi="Times New Roman" w:cs="Times New Roman"/>
-          <w:kern w:val="0"/>
-          <w:sz w:val="24"/>
-          <w:szCs w:val="24"/>
-          <w:lang w:eastAsia="fr-FR"/>
-          <w14:ligatures w14:val="none"/>
-        </w:rPr>
-        <w:t>Vanishing / Exploding gradients</w:t>
+      <w:proofErr w:type="spellStart"/>
+      <w:r>
+        <w:rPr>
+          <w:rFonts w:ascii="Times New Roman" w:eastAsia="Times New Roman" w:hAnsi="Times New Roman" w:cs="Times New Roman"/>
+          <w:kern w:val="0"/>
+          <w:sz w:val="24"/>
+          <w:szCs w:val="24"/>
+          <w:lang w:eastAsia="fr-FR"/>
+          <w14:ligatures w14:val="none"/>
+        </w:rPr>
+        <w:t>Vanishing</w:t>
+      </w:r>
+      <w:proofErr w:type="spellEnd"/>
+      <w:r>
+        <w:rPr>
+          <w:rFonts w:ascii="Times New Roman" w:eastAsia="Times New Roman" w:hAnsi="Times New Roman" w:cs="Times New Roman"/>
+          <w:kern w:val="0"/>
+          <w:sz w:val="24"/>
+          <w:szCs w:val="24"/>
+          <w:lang w:eastAsia="fr-FR"/>
+          <w14:ligatures w14:val="none"/>
+        </w:rPr>
+        <w:t xml:space="preserve"> / </w:t>
+      </w:r>
+      <w:proofErr w:type="spellStart"/>
+      <w:r>
+        <w:rPr>
+          <w:rFonts w:ascii="Times New Roman" w:eastAsia="Times New Roman" w:hAnsi="Times New Roman" w:cs="Times New Roman"/>
+          <w:kern w:val="0"/>
+          <w:sz w:val="24"/>
+          <w:szCs w:val="24"/>
+          <w:lang w:eastAsia="fr-FR"/>
+          <w14:ligatures w14:val="none"/>
+        </w:rPr>
+        <w:t>Exploding</w:t>
+      </w:r>
+      <w:proofErr w:type="spellEnd"/>
+      <w:r>
+        <w:rPr>
+          <w:rFonts w:ascii="Times New Roman" w:eastAsia="Times New Roman" w:hAnsi="Times New Roman" w:cs="Times New Roman"/>
+          <w:kern w:val="0"/>
+          <w:sz w:val="24"/>
+          <w:szCs w:val="24"/>
+          <w:lang w:eastAsia="fr-FR"/>
+          <w14:ligatures w14:val="none"/>
+        </w:rPr>
+        <w:t xml:space="preserve"> gradients</w:t>
       </w:r>
     </w:p>
     <w:p>
@@ -4142,7 +5677,31 @@
           <w:lang w:eastAsia="fr-FR"/>
           <w14:ligatures w14:val="none"/>
         </w:rPr>
-        <w:t>Normalisation (BatchNorm)</w:t>
+        <w:t>Normalisation (</w:t>
+      </w:r>
+      <w:proofErr w:type="spellStart"/>
+      <w:r>
+        <w:rPr>
+          <w:rFonts w:ascii="Times New Roman" w:eastAsia="Times New Roman" w:hAnsi="Times New Roman" w:cs="Times New Roman"/>
+          <w:kern w:val="0"/>
+          <w:sz w:val="24"/>
+          <w:szCs w:val="24"/>
+          <w:lang w:eastAsia="fr-FR"/>
+          <w14:ligatures w14:val="none"/>
+        </w:rPr>
+        <w:t>BatchNorm</w:t>
+      </w:r>
+      <w:proofErr w:type="spellEnd"/>
+      <w:r>
+        <w:rPr>
+          <w:rFonts w:ascii="Times New Roman" w:eastAsia="Times New Roman" w:hAnsi="Times New Roman" w:cs="Times New Roman"/>
+          <w:kern w:val="0"/>
+          <w:sz w:val="24"/>
+          <w:szCs w:val="24"/>
+          <w:lang w:eastAsia="fr-FR"/>
+          <w14:ligatures w14:val="none"/>
+        </w:rPr>
+        <w:t>)</w:t>
       </w:r>
     </w:p>
     <w:p>
@@ -4204,6 +5763,7 @@
           <w14:ligatures w14:val="none"/>
         </w:rPr>
       </w:pPr>
+      <w:proofErr w:type="gramStart"/>
       <w:r>
         <w:rPr>
           <w:rFonts w:ascii="Courier New" w:eastAsia="Times New Roman" w:hAnsi="Courier New" w:cs="Courier New"/>
@@ -4213,7 +5773,43 @@
           <w:lang w:eastAsia="fr-FR"/>
           <w14:ligatures w14:val="none"/>
         </w:rPr>
-        <w:t>nn.BatchNorm2d(32)</w:t>
+        <w:t>nn.BatchNorm</w:t>
+      </w:r>
+      <w:proofErr w:type="gramEnd"/>
+      <w:r>
+        <w:rPr>
+          <w:rFonts w:ascii="Courier New" w:eastAsia="Times New Roman" w:hAnsi="Courier New" w:cs="Courier New"/>
+          <w:kern w:val="0"/>
+          <w:sz w:val="20"/>
+          <w:szCs w:val="20"/>
+          <w:lang w:eastAsia="fr-FR"/>
+          <w14:ligatures w14:val="none"/>
+        </w:rPr>
+        <w:t>2</w:t>
+      </w:r>
+      <w:proofErr w:type="gramStart"/>
+      <w:r>
+        <w:rPr>
+          <w:rFonts w:ascii="Courier New" w:eastAsia="Times New Roman" w:hAnsi="Courier New" w:cs="Courier New"/>
+          <w:kern w:val="0"/>
+          <w:sz w:val="20"/>
+          <w:szCs w:val="20"/>
+          <w:lang w:eastAsia="fr-FR"/>
+          <w14:ligatures w14:val="none"/>
+        </w:rPr>
+        <w:t>d(</w:t>
+      </w:r>
+      <w:proofErr w:type="gramEnd"/>
+      <w:r>
+        <w:rPr>
+          <w:rFonts w:ascii="Courier New" w:eastAsia="Times New Roman" w:hAnsi="Courier New" w:cs="Courier New"/>
+          <w:kern w:val="0"/>
+          <w:sz w:val="20"/>
+          <w:szCs w:val="20"/>
+          <w:lang w:eastAsia="fr-FR"/>
+          <w14:ligatures w14:val="none"/>
+        </w:rPr>
+        <w:t>32)</w:t>
       </w:r>
     </w:p>
     <w:p>
@@ -4476,6 +6072,7 @@
           <w14:ligatures w14:val="none"/>
         </w:rPr>
       </w:pPr>
+      <w:proofErr w:type="spellStart"/>
       <w:r>
         <w:rPr>
           <w:rFonts w:ascii="Times New Roman" w:eastAsia="Times New Roman" w:hAnsi="Times New Roman" w:cs="Times New Roman"/>
@@ -4487,6 +6084,7 @@
         </w:rPr>
         <w:t>Autoencoders</w:t>
       </w:r>
+      <w:proofErr w:type="spellEnd"/>
     </w:p>
     <w:p>
       <w:pPr>
@@ -4617,8 +6215,21 @@
           <w:lang w:eastAsia="fr-FR"/>
           <w14:ligatures w14:val="none"/>
         </w:rPr>
-        <w:t>Image autoencoder</w:t>
-      </w:r>
+        <w:t xml:space="preserve">Image </w:t>
+      </w:r>
+      <w:proofErr w:type="spellStart"/>
+      <w:r>
+        <w:rPr>
+          <w:rFonts w:ascii="Times New Roman" w:eastAsia="Times New Roman" w:hAnsi="Times New Roman" w:cs="Times New Roman"/>
+          <w:kern w:val="0"/>
+          <w:sz w:val="24"/>
+          <w:szCs w:val="24"/>
+          <w:lang w:eastAsia="fr-FR"/>
+          <w14:ligatures w14:val="none"/>
+        </w:rPr>
+        <w:t>autoencoder</w:t>
+      </w:r>
+      <w:proofErr w:type="spellEnd"/>
     </w:p>
     <w:p>
       <w:pPr>
@@ -4833,16 +6444,29 @@
           <w14:ligatures w14:val="none"/>
         </w:rPr>
       </w:pPr>
-      <w:r>
-        <w:rPr>
-          <w:rFonts w:ascii="Times New Roman" w:eastAsia="Times New Roman" w:hAnsi="Times New Roman" w:cs="Times New Roman"/>
-          <w:kern w:val="0"/>
-          <w:sz w:val="24"/>
-          <w:szCs w:val="24"/>
-          <w:lang w:eastAsia="fr-FR"/>
-          <w14:ligatures w14:val="none"/>
-        </w:rPr>
-        <w:t>Dataset réel</w:t>
+      <w:proofErr w:type="spellStart"/>
+      <w:r>
+        <w:rPr>
+          <w:rFonts w:ascii="Times New Roman" w:eastAsia="Times New Roman" w:hAnsi="Times New Roman" w:cs="Times New Roman"/>
+          <w:kern w:val="0"/>
+          <w:sz w:val="24"/>
+          <w:szCs w:val="24"/>
+          <w:lang w:eastAsia="fr-FR"/>
+          <w14:ligatures w14:val="none"/>
+        </w:rPr>
+        <w:t>Dataset</w:t>
+      </w:r>
+      <w:proofErr w:type="spellEnd"/>
+      <w:r>
+        <w:rPr>
+          <w:rFonts w:ascii="Times New Roman" w:eastAsia="Times New Roman" w:hAnsi="Times New Roman" w:cs="Times New Roman"/>
+          <w:kern w:val="0"/>
+          <w:sz w:val="24"/>
+          <w:szCs w:val="24"/>
+          <w:lang w:eastAsia="fr-FR"/>
+          <w14:ligatures w14:val="none"/>
+        </w:rPr>
+        <w:t xml:space="preserve"> réel</w:t>
       </w:r>
     </w:p>
     <w:p>

</xml_diff>